<commit_message>
Demo script: the problem from Chapter 1 and the signed business requirements
The problem statement and objectives now follow Chapter 1 of the paper,
and the requirements are the seven signed groups (BR 1 to 7) with each
demo step pointing at the BR it shows; additions made during development
are listed apart. Limits come from the signed form. Q&A adds the CSUQ and
two questions the paper invites (Spring Boot vs Node.js; local/Windows vs
online), left for the team to answer.

Co-Authored-By: Claude Opus 5.5 <noreply@anthropic.com>
</commit_message>
<xml_diff>
--- a/QA/FETCH-Demo-Script.docx
+++ b/QA/FETCH-Demo-Script.docx
@@ -3794,11 +3794,11 @@
           <w:rFonts w:ascii="Arial" w:cs="Arial" w:eastAsia="Arial" w:hAnsi="Arial"/>
           <w:i/>
           <w:iCs/>
-          <w:color w:val="7A4B00"/>
+          <w:color w:val="555555"/>
           <w:sz w:val="19"/>
           <w:szCs w:val="19"/>
         </w:rPr>
-        <w:t xml:space="preserve">Use the exact problem statement of your Chapter 1 here if its wording differs. The points below are the problems the system is built to answer, one for each part of the demo.</w:t>
+        <w:t xml:space="preserve">Taken from Chapter 1 of the paper (Introduction, Significance of the Study and Objectives of the Study).</w:t>
       </w:r>
     </w:p>
     <w:tbl>
@@ -3928,7 +3928,7 @@
                 <w:sz w:val="20"/>
                 <w:szCs w:val="20"/>
               </w:rPr>
-              <w:t xml:space="preserve">"A pet supply shop lives on its stock. If a product runs out, the customer goes elsewhere; if too much is ordered, money is tied up on the shelf; and if a product expires before it sells, it is a loss."</w:t>
+              <w:t xml:space="preserve">"The pet care industry keeps growing, because people now treat their pets as part of the family and buy them good food, grooming and health products."</w:t>
             </w:r>
           </w:p>
           <w:p>
@@ -3942,7 +3942,7 @@
                 <w:sz w:val="20"/>
                 <w:szCs w:val="20"/>
               </w:rPr>
-              <w:t xml:space="preserve">"Without a system, the owner has to count the shelves to know what is left, notice expiry dates by checking each product, and decide what to order and how much by memory and guesswork."</w:t>
+              <w:t xml:space="preserve">"For a small shop like Risha Pet Supplies, that means a long list of products to keep track of: food, grooming supplies, toys, accessories and health products, many of them with expiration dates."</w:t>
             </w:r>
           </w:p>
         </w:tc>
@@ -4080,7 +4080,7 @@
                 <w:sz w:val="20"/>
                 <w:szCs w:val="20"/>
               </w:rPr>
-              <w:t xml:space="preserve">"At the counter, every sale has to be recorded and the cash has to match at the end of the day. When stock is not updated with each sale, the records stop matching the shelf."</w:t>
+              <w:t xml:space="preserve">"Small pet stores usually manage all of this by hand. They count what is on the shelves, write the numbers in spreadsheets, and decide when and how much to order from memory and feeling."</w:t>
             </w:r>
           </w:p>
           <w:p>
@@ -4094,7 +4094,7 @@
                 <w:sz w:val="20"/>
                 <w:szCs w:val="20"/>
               </w:rPr>
-              <w:t xml:space="preserve">"With suppliers, orders, delivery dates and payments are followed up one by one, by phone or message, and there is no record of which supplier delivers on time."</w:t>
+              <w:t xml:space="preserve">"This causes clear problems. Popular items sell out, which means lost sales and unhappy customers. Other products sit on the shelves, which wastes money and space. And poor ordering decisions hurt the relationship with suppliers."</w:t>
             </w:r>
           </w:p>
           <w:p>
@@ -4108,7 +4108,159 @@
                 <w:sz w:val="20"/>
                 <w:szCs w:val="20"/>
               </w:rPr>
-              <w:t xml:space="preserve">"So the shop needed one place that keeps the stock right automatically, warns before problems happen, and turns its own sales history into a clear instruction: order this many, by this date."</w:t>
+              <w:t xml:space="preserve">"A small business cannot afford these mistakes, because it works with little money to spare."</w:t>
+            </w:r>
+          </w:p>
+        </w:tc>
+      </w:tr>
+    </w:tbl>
+    <w:p>
+      <w:pPr>
+        <w:spacing w:after="160"/>
+      </w:pPr>
+    </w:p>
+    <w:tbl>
+      <w:tblPr>
+        <w:tblW w:type="dxa" w:w="9360"/>
+        <w:tblBorders>
+          <w:top w:val="single" w:color="auto" w:sz="4"/>
+          <w:left w:val="single" w:color="auto" w:sz="4"/>
+          <w:bottom w:val="single" w:color="auto" w:sz="4"/>
+          <w:right w:val="single" w:color="auto" w:sz="4"/>
+          <w:insideH w:val="single" w:color="auto" w:sz="4"/>
+          <w:insideV w:val="single" w:color="auto" w:sz="4"/>
+        </w:tblBorders>
+        <w:tblLayout w:type="fixed"/>
+      </w:tblPr>
+      <w:tblGrid>
+        <w:gridCol w:w="1300"/>
+        <w:gridCol w:w="8060"/>
+      </w:tblGrid>
+      <w:tr>
+        <w:trPr>
+          <w:cantSplit/>
+        </w:trPr>
+        <w:tc>
+          <w:tcPr>
+            <w:tcW w:type="dxa" w:w="9360"/>
+            <w:gridSpan w:val="2"/>
+            <w:tcBorders>
+              <w:top w:val="single" w:color="A6A6A6" w:sz="4"/>
+              <w:left w:val="single" w:color="A6A6A6" w:sz="4"/>
+              <w:bottom w:val="single" w:color="A6A6A6" w:sz="4"/>
+              <w:right w:val="single" w:color="A6A6A6" w:sz="4"/>
+            </w:tcBorders>
+            <w:shd w:fill="3E8E41" w:val="clear"/>
+            <w:tcMar>
+              <w:top w:type="dxa" w:w="70"/>
+              <w:left w:type="dxa" w:w="120"/>
+              <w:bottom w:type="dxa" w:w="70"/>
+              <w:right w:type="dxa" w:w="120"/>
+            </w:tcMar>
+            <w:vAlign w:val="center"/>
+          </w:tcPr>
+          <w:p>
+            <w:pPr>
+              <w:spacing w:after="0" w:line="264"/>
+              <w:jc w:val="left"/>
+            </w:pPr>
+            <w:r>
+              <w:rPr>
+                <w:rFonts w:ascii="Arial" w:cs="Arial" w:eastAsia="Arial" w:hAnsi="Arial"/>
+                <w:b/>
+                <w:bCs/>
+                <w:color w:val="FFFFFF"/>
+                <w:sz w:val="18"/>
+                <w:szCs w:val="18"/>
+              </w:rPr>
+              <w:t xml:space="preserve">3.3   SPEAKER 1 — Juan Carlo</w:t>
+            </w:r>
+          </w:p>
+        </w:tc>
+      </w:tr>
+      <w:tr>
+        <w:trPr>
+          <w:cantSplit/>
+        </w:trPr>
+        <w:tc>
+          <w:tcPr>
+            <w:tcW w:type="dxa" w:w="1300"/>
+            <w:tcBorders>
+              <w:top w:val="single" w:color="A6A6A6" w:sz="4"/>
+              <w:left w:val="single" w:color="A6A6A6" w:sz="4"/>
+              <w:bottom w:val="single" w:color="A6A6A6" w:sz="4"/>
+              <w:right w:val="single" w:color="A6A6A6" w:sz="4"/>
+            </w:tcBorders>
+            <w:shd w:fill="E8F3E5" w:val="clear"/>
+            <w:tcMar>
+              <w:top w:type="dxa" w:w="70"/>
+              <w:left w:type="dxa" w:w="120"/>
+              <w:bottom w:type="dxa" w:w="70"/>
+              <w:right w:type="dxa" w:w="120"/>
+            </w:tcMar>
+            <w:vAlign w:val="top"/>
+          </w:tcPr>
+          <w:p>
+            <w:pPr>
+              <w:spacing w:after="0" w:line="264"/>
+              <w:jc w:val="left"/>
+            </w:pPr>
+            <w:r>
+              <w:rPr>
+                <w:rFonts w:ascii="Arial" w:cs="Arial" w:eastAsia="Arial" w:hAnsi="Arial"/>
+                <w:b/>
+                <w:bCs/>
+                <w:color w:val="1E4D2B"/>
+                <w:sz w:val="17"/>
+                <w:szCs w:val="17"/>
+              </w:rPr>
+              <w:t xml:space="preserve">SAY</w:t>
+            </w:r>
+          </w:p>
+        </w:tc>
+        <w:tc>
+          <w:tcPr>
+            <w:tcW w:type="dxa" w:w="8060"/>
+            <w:tcBorders>
+              <w:top w:val="single" w:color="A6A6A6" w:sz="4"/>
+              <w:left w:val="single" w:color="A6A6A6" w:sz="4"/>
+              <w:bottom w:val="single" w:color="A6A6A6" w:sz="4"/>
+              <w:right w:val="single" w:color="A6A6A6" w:sz="4"/>
+            </w:tcBorders>
+            <w:tcMar>
+              <w:top w:type="dxa" w:w="70"/>
+              <w:left w:type="dxa" w:w="120"/>
+              <w:bottom w:type="dxa" w:w="70"/>
+              <w:right w:type="dxa" w:w="120"/>
+            </w:tcMar>
+            <w:vAlign w:val="top"/>
+          </w:tcPr>
+          <w:p>
+            <w:pPr>
+              <w:spacing w:after="100" w:line="264"/>
+              <w:jc w:val="left"/>
+            </w:pPr>
+            <w:r>
+              <w:rPr>
+                <w:rFonts w:ascii="Arial" w:cs="Arial" w:eastAsia="Arial" w:hAnsi="Arial"/>
+                <w:sz w:val="20"/>
+                <w:szCs w:val="20"/>
+              </w:rPr>
+              <w:t xml:space="preserve">"In short, FETCH answers five problems: stock records that do not match the shelf, overstocking, stockouts, errors from manual processing, and poor coordination with suppliers."</w:t>
+            </w:r>
+          </w:p>
+          <w:p>
+            <w:pPr>
+              <w:spacing w:after="0" w:line="264"/>
+              <w:jc w:val="left"/>
+            </w:pPr>
+            <w:r>
+              <w:rPr>
+                <w:rFonts w:ascii="Arial" w:cs="Arial" w:eastAsia="Arial" w:hAnsi="Arial"/>
+                <w:sz w:val="20"/>
+                <w:szCs w:val="20"/>
+              </w:rPr>
+              <w:t xml:space="preserve">"So our objective was to develop FETCH: an inventory system that forecasts demand with an ensemble of Random Forest and Gradient Boosting, uses barcode scanning, reorders automatically when stock reaches the reorder point, tracks stock and expiration dates in real time, and works with the suppliers. We then tested it with unit testing, system testing and user acceptance testing, and evaluated its usability with the CSUQ."</w:t>
             </w:r>
           </w:p>
         </w:tc>
@@ -4339,7 +4491,7 @@
                 <w:sz w:val="20"/>
                 <w:szCs w:val="20"/>
               </w:rPr>
-              <w:t xml:space="preserve">"From the shop's needs we set these business requirements. For each one, we will point out the part of the demo that shows it is met."</w:t>
+              <w:t xml:space="preserve">"These are the business requirements we agreed with the owner of Risha Pet Supplies and signed. There are seven groups. During the demo we will point out where each one is met."</w:t>
             </w:r>
           </w:p>
         </w:tc>
@@ -4349,6 +4501,22 @@
       <w:pPr>
         <w:spacing w:after="160"/>
       </w:pPr>
+    </w:p>
+    <w:p>
+      <w:pPr>
+        <w:spacing w:after="120" w:before="0" w:line="288"/>
+      </w:pPr>
+      <w:r>
+        <w:rPr>
+          <w:rFonts w:ascii="Arial" w:cs="Arial" w:eastAsia="Arial" w:hAnsi="Arial"/>
+          <w:i/>
+          <w:iCs/>
+          <w:color w:val="555555"/>
+          <w:sz w:val="19"/>
+          <w:szCs w:val="19"/>
+        </w:rPr>
+        <w:t xml:space="preserve">From the signed Business Requirements form (FETCH_Business Requirements, 3 pages).</w:t>
+      </w:r>
     </w:p>
     <w:tbl>
       <w:tblPr>
@@ -4365,8 +4533,8 @@
       </w:tblPr>
       <w:tblGrid>
         <w:gridCol w:w="700"/>
-        <w:gridCol w:w="4900"/>
-        <w:gridCol w:w="3760"/>
+        <w:gridCol w:w="5000"/>
+        <w:gridCol w:w="3660"/>
       </w:tblGrid>
       <w:tr>
         <w:trPr>
@@ -4405,13 +4573,13 @@
                 <w:sz w:val="19"/>
                 <w:szCs w:val="19"/>
               </w:rPr>
-              <w:t xml:space="preserve">#</w:t>
-            </w:r>
-          </w:p>
-        </w:tc>
-        <w:tc>
-          <w:tcPr>
-            <w:tcW w:type="dxa" w:w="4900"/>
+              <w:t xml:space="preserve">BR</w:t>
+            </w:r>
+          </w:p>
+        </w:tc>
+        <w:tc>
+          <w:tcPr>
+            <w:tcW w:type="dxa" w:w="5000"/>
             <w:tcBorders>
               <w:top w:val="single" w:color="A6A6A6" w:sz="4"/>
               <w:left w:val="single" w:color="A6A6A6" w:sz="4"/>
@@ -4441,13 +4609,13 @@
                 <w:sz w:val="19"/>
                 <w:szCs w:val="19"/>
               </w:rPr>
-              <w:t xml:space="preserve">Business requirement</w:t>
-            </w:r>
-          </w:p>
-        </w:tc>
-        <w:tc>
-          <w:tcPr>
-            <w:tcW w:type="dxa" w:w="3760"/>
+              <w:t xml:space="preserve">Business requirement (signed)</w:t>
+            </w:r>
+          </w:p>
+        </w:tc>
+        <w:tc>
+          <w:tcPr>
+            <w:tcW w:type="dxa" w:w="3660"/>
             <w:tcBorders>
               <w:top w:val="single" w:color="A6A6A6" w:sz="4"/>
               <w:left w:val="single" w:color="A6A6A6" w:sz="4"/>
@@ -4517,13 +4685,13 @@
                 <w:sz w:val="19"/>
                 <w:szCs w:val="19"/>
               </w:rPr>
-              <w:t xml:space="preserve">BR-01</w:t>
-            </w:r>
-          </w:p>
-        </w:tc>
-        <w:tc>
-          <w:tcPr>
-            <w:tcW w:type="dxa" w:w="4900"/>
+              <w:t xml:space="preserve">1</w:t>
+            </w:r>
+          </w:p>
+        </w:tc>
+        <w:tc>
+          <w:tcPr>
+            <w:tcW w:type="dxa" w:w="5000"/>
             <w:tcBorders>
               <w:top w:val="single" w:color="A6A6A6" w:sz="4"/>
               <w:left w:val="single" w:color="A6A6A6" w:sz="4"/>
@@ -4551,27 +4719,9 @@
                 <w:sz w:val="19"/>
                 <w:szCs w:val="19"/>
               </w:rPr>
-              <w:t xml:space="preserve">Keep a record of every product: price, cost, stock, reorder level, supplier and expiration date.</w:t>
-            </w:r>
-          </w:p>
-        </w:tc>
-        <w:tc>
-          <w:tcPr>
-            <w:tcW w:type="dxa" w:w="3760"/>
-            <w:tcBorders>
-              <w:top w:val="single" w:color="A6A6A6" w:sz="4"/>
-              <w:left w:val="single" w:color="A6A6A6" w:sz="4"/>
-              <w:bottom w:val="single" w:color="A6A6A6" w:sz="4"/>
-              <w:right w:val="single" w:color="A6A6A6" w:sz="4"/>
-            </w:tcBorders>
-            <w:tcMar>
-              <w:top w:type="dxa" w:w="70"/>
-              <w:left w:type="dxa" w:w="120"/>
-              <w:bottom w:type="dxa" w:w="70"/>
-              <w:right w:type="dxa" w:w="120"/>
-            </w:tcMar>
-            <w:vAlign w:val="top"/>
-          </w:tcPr>
+              <w:t xml:space="preserve">The owner (Admin) manages the system:</w:t>
+            </w:r>
+          </w:p>
           <w:p>
             <w:pPr>
               <w:spacing w:after="0" w:line="264"/>
@@ -4585,53 +4735,13 @@
                 <w:sz w:val="19"/>
                 <w:szCs w:val="19"/>
               </w:rPr>
-              <w:t xml:space="preserve">Part 5: adding a product</w:t>
-            </w:r>
-          </w:p>
-        </w:tc>
-      </w:tr>
-      <w:tr>
-        <w:trPr>
-          <w:cantSplit/>
-        </w:trPr>
-        <w:tc>
-          <w:tcPr>
-            <w:tcW w:type="dxa" w:w="700"/>
-            <w:tcBorders>
-              <w:top w:val="single" w:color="A6A6A6" w:sz="4"/>
-              <w:left w:val="single" w:color="A6A6A6" w:sz="4"/>
-              <w:bottom w:val="single" w:color="A6A6A6" w:sz="4"/>
-              <w:right w:val="single" w:color="A6A6A6" w:sz="4"/>
-            </w:tcBorders>
-            <w:shd w:fill="E8F3E5" w:val="clear"/>
-            <w:tcMar>
-              <w:top w:type="dxa" w:w="70"/>
-              <w:left w:type="dxa" w:w="120"/>
-              <w:bottom w:type="dxa" w:w="70"/>
-              <w:right w:type="dxa" w:w="120"/>
-            </w:tcMar>
-            <w:vAlign w:val="top"/>
-          </w:tcPr>
-          <w:p>
-            <w:pPr>
-              <w:spacing w:after="0" w:line="264"/>
-              <w:jc w:val="left"/>
-            </w:pPr>
-            <w:r>
-              <w:rPr>
-                <w:rFonts w:ascii="Arial" w:cs="Arial" w:eastAsia="Arial" w:hAnsi="Arial"/>
-                <w:b/>
-                <w:bCs/>
-                <w:sz w:val="19"/>
-                <w:szCs w:val="19"/>
-              </w:rPr>
-              <w:t xml:space="preserve">BR-02</w:t>
-            </w:r>
-          </w:p>
-        </w:tc>
-        <w:tc>
-          <w:tcPr>
-            <w:tcW w:type="dxa" w:w="4900"/>
+              <w:t xml:space="preserve">1.1 an administrator account with full access; 1.2 staff accounts with limited POS access; 1.3 user access control and permissions.</w:t>
+            </w:r>
+          </w:p>
+        </w:tc>
+        <w:tc>
+          <w:tcPr>
+            <w:tcW w:type="dxa" w:w="3660"/>
             <w:tcBorders>
               <w:top w:val="single" w:color="A6A6A6" w:sz="4"/>
               <w:left w:val="single" w:color="A6A6A6" w:sz="4"/>
@@ -4659,13 +4769,53 @@
                 <w:sz w:val="19"/>
                 <w:szCs w:val="19"/>
               </w:rPr>
-              <w:t xml:space="preserve">Check every input and say exactly what is wrong, so no wrong data is saved.</w:t>
-            </w:r>
-          </w:p>
-        </w:tc>
-        <w:tc>
-          <w:tcPr>
-            <w:tcW w:type="dxa" w:w="3760"/>
+              <w:t xml:space="preserve">Part 5 (the administrator); Part 8 (the cashier is kept on the Point of Sale)</w:t>
+            </w:r>
+          </w:p>
+        </w:tc>
+      </w:tr>
+      <w:tr>
+        <w:trPr>
+          <w:cantSplit/>
+        </w:trPr>
+        <w:tc>
+          <w:tcPr>
+            <w:tcW w:type="dxa" w:w="700"/>
+            <w:tcBorders>
+              <w:top w:val="single" w:color="A6A6A6" w:sz="4"/>
+              <w:left w:val="single" w:color="A6A6A6" w:sz="4"/>
+              <w:bottom w:val="single" w:color="A6A6A6" w:sz="4"/>
+              <w:right w:val="single" w:color="A6A6A6" w:sz="4"/>
+            </w:tcBorders>
+            <w:shd w:fill="E8F3E5" w:val="clear"/>
+            <w:tcMar>
+              <w:top w:type="dxa" w:w="70"/>
+              <w:left w:type="dxa" w:w="120"/>
+              <w:bottom w:type="dxa" w:w="70"/>
+              <w:right w:type="dxa" w:w="120"/>
+            </w:tcMar>
+            <w:vAlign w:val="top"/>
+          </w:tcPr>
+          <w:p>
+            <w:pPr>
+              <w:spacing w:after="0" w:line="264"/>
+              <w:jc w:val="left"/>
+            </w:pPr>
+            <w:r>
+              <w:rPr>
+                <w:rFonts w:ascii="Arial" w:cs="Arial" w:eastAsia="Arial" w:hAnsi="Arial"/>
+                <w:b/>
+                <w:bCs/>
+                <w:sz w:val="19"/>
+                <w:szCs w:val="19"/>
+              </w:rPr>
+              <w:t xml:space="preserve">2</w:t>
+            </w:r>
+          </w:p>
+        </w:tc>
+        <w:tc>
+          <w:tcPr>
+            <w:tcW w:type="dxa" w:w="5000"/>
             <w:tcBorders>
               <w:top w:val="single" w:color="A6A6A6" w:sz="4"/>
               <w:left w:val="single" w:color="A6A6A6" w:sz="4"/>
@@ -4693,67 +4843,9 @@
                 <w:sz w:val="19"/>
                 <w:szCs w:val="19"/>
               </w:rPr>
-              <w:t xml:space="preserve">Part 5: the product form; and the till</w:t>
-            </w:r>
-          </w:p>
-        </w:tc>
-      </w:tr>
-      <w:tr>
-        <w:trPr>
-          <w:cantSplit/>
-        </w:trPr>
-        <w:tc>
-          <w:tcPr>
-            <w:tcW w:type="dxa" w:w="700"/>
-            <w:tcBorders>
-              <w:top w:val="single" w:color="A6A6A6" w:sz="4"/>
-              <w:left w:val="single" w:color="A6A6A6" w:sz="4"/>
-              <w:bottom w:val="single" w:color="A6A6A6" w:sz="4"/>
-              <w:right w:val="single" w:color="A6A6A6" w:sz="4"/>
-            </w:tcBorders>
-            <w:shd w:fill="E8F3E5" w:val="clear"/>
-            <w:tcMar>
-              <w:top w:type="dxa" w:w="70"/>
-              <w:left w:type="dxa" w:w="120"/>
-              <w:bottom w:type="dxa" w:w="70"/>
-              <w:right w:type="dxa" w:w="120"/>
-            </w:tcMar>
-            <w:vAlign w:val="top"/>
-          </w:tcPr>
-          <w:p>
-            <w:pPr>
-              <w:spacing w:after="0" w:line="264"/>
-              <w:jc w:val="left"/>
-            </w:pPr>
-            <w:r>
-              <w:rPr>
-                <w:rFonts w:ascii="Arial" w:cs="Arial" w:eastAsia="Arial" w:hAnsi="Arial"/>
-                <w:b/>
-                <w:bCs/>
-                <w:sz w:val="19"/>
-                <w:szCs w:val="19"/>
-              </w:rPr>
-              <w:t xml:space="preserve">BR-03</w:t>
-            </w:r>
-          </w:p>
-        </w:tc>
-        <w:tc>
-          <w:tcPr>
-            <w:tcW w:type="dxa" w:w="4900"/>
-            <w:tcBorders>
-              <w:top w:val="single" w:color="A6A6A6" w:sz="4"/>
-              <w:left w:val="single" w:color="A6A6A6" w:sz="4"/>
-              <w:bottom w:val="single" w:color="A6A6A6" w:sz="4"/>
-              <w:right w:val="single" w:color="A6A6A6" w:sz="4"/>
-            </w:tcBorders>
-            <w:tcMar>
-              <w:top w:type="dxa" w:w="70"/>
-              <w:left w:type="dxa" w:w="120"/>
-              <w:bottom w:type="dxa" w:w="70"/>
-              <w:right w:type="dxa" w:w="120"/>
-            </w:tcMar>
-            <w:vAlign w:val="top"/>
-          </w:tcPr>
+              <w:t xml:space="preserve">Admin and Staff manage inventory and sales:</w:t>
+            </w:r>
+          </w:p>
           <w:p>
             <w:pPr>
               <w:spacing w:after="0" w:line="264"/>
@@ -4767,13 +4859,13 @@
                 <w:sz w:val="19"/>
                 <w:szCs w:val="19"/>
               </w:rPr>
-              <w:t xml:space="preserve">Give each product a code (SKU) that follows one fixed pattern.</w:t>
-            </w:r>
-          </w:p>
-        </w:tc>
-        <w:tc>
-          <w:tcPr>
-            <w:tcW w:type="dxa" w:w="3760"/>
+              <w:t xml:space="preserve">2.1 add, edit and track products and stock; 2.2 view the forecasts and reorder recommendations; 2.3 POS with barcode scanning; 2.4 stock updated after each sale; 2.5 no duplicate entries.</w:t>
+            </w:r>
+          </w:p>
+        </w:tc>
+        <w:tc>
+          <w:tcPr>
+            <w:tcW w:type="dxa" w:w="3660"/>
             <w:tcBorders>
               <w:top w:val="single" w:color="A6A6A6" w:sz="4"/>
               <w:left w:val="single" w:color="A6A6A6" w:sz="4"/>
@@ -4801,7 +4893,7 @@
                 <w:sz w:val="19"/>
                 <w:szCs w:val="19"/>
               </w:rPr>
-              <w:t xml:space="preserve">Part 5: the SKU is made from the product type</w:t>
+              <w:t xml:space="preserve">Part 5 (products; the SKU and barcode cannot be duplicated); Part 8 (selling); Part 9 (forecast)</w:t>
             </w:r>
           </w:p>
         </w:tc>
@@ -4841,13 +4933,13 @@
                 <w:sz w:val="19"/>
                 <w:szCs w:val="19"/>
               </w:rPr>
-              <w:t xml:space="preserve">BR-04</w:t>
-            </w:r>
-          </w:p>
-        </w:tc>
-        <w:tc>
-          <w:tcPr>
-            <w:tcW w:type="dxa" w:w="4900"/>
+              <w:t xml:space="preserve">3</w:t>
+            </w:r>
+          </w:p>
+        </w:tc>
+        <w:tc>
+          <w:tcPr>
+            <w:tcW w:type="dxa" w:w="5000"/>
             <w:tcBorders>
               <w:top w:val="single" w:color="A6A6A6" w:sz="4"/>
               <w:left w:val="single" w:color="A6A6A6" w:sz="4"/>
@@ -4875,27 +4967,9 @@
                 <w:sz w:val="19"/>
                 <w:szCs w:val="19"/>
               </w:rPr>
-              <w:t xml:space="preserve">Warn about low stock, sold-out and expiring products.</w:t>
-            </w:r>
-          </w:p>
-        </w:tc>
-        <w:tc>
-          <w:tcPr>
-            <w:tcW w:type="dxa" w:w="3760"/>
-            <w:tcBorders>
-              <w:top w:val="single" w:color="A6A6A6" w:sz="4"/>
-              <w:left w:val="single" w:color="A6A6A6" w:sz="4"/>
-              <w:bottom w:val="single" w:color="A6A6A6" w:sz="4"/>
-              <w:right w:val="single" w:color="A6A6A6" w:sz="4"/>
-            </w:tcBorders>
-            <w:tcMar>
-              <w:top w:type="dxa" w:w="70"/>
-              <w:left w:type="dxa" w:w="120"/>
-              <w:bottom w:type="dxa" w:w="70"/>
-              <w:right w:type="dxa" w:w="120"/>
-            </w:tcMar>
-            <w:vAlign w:val="top"/>
-          </w:tcPr>
+              <w:t xml:space="preserve">Complete inventory records:</w:t>
+            </w:r>
+          </w:p>
           <w:p>
             <w:pPr>
               <w:spacing w:after="0" w:line="264"/>
@@ -4909,53 +4983,13 @@
                 <w:sz w:val="19"/>
                 <w:szCs w:val="19"/>
               </w:rPr>
-              <w:t xml:space="preserve">Part 5: Dashboard and Inventory</w:t>
-            </w:r>
-          </w:p>
-        </w:tc>
-      </w:tr>
-      <w:tr>
-        <w:trPr>
-          <w:cantSplit/>
-        </w:trPr>
-        <w:tc>
-          <w:tcPr>
-            <w:tcW w:type="dxa" w:w="700"/>
-            <w:tcBorders>
-              <w:top w:val="single" w:color="A6A6A6" w:sz="4"/>
-              <w:left w:val="single" w:color="A6A6A6" w:sz="4"/>
-              <w:bottom w:val="single" w:color="A6A6A6" w:sz="4"/>
-              <w:right w:val="single" w:color="A6A6A6" w:sz="4"/>
-            </w:tcBorders>
-            <w:shd w:fill="E8F3E5" w:val="clear"/>
-            <w:tcMar>
-              <w:top w:type="dxa" w:w="70"/>
-              <w:left w:type="dxa" w:w="120"/>
-              <w:bottom w:type="dxa" w:w="70"/>
-              <w:right w:type="dxa" w:w="120"/>
-            </w:tcMar>
-            <w:vAlign w:val="top"/>
-          </w:tcPr>
-          <w:p>
-            <w:pPr>
-              <w:spacing w:after="0" w:line="264"/>
-              <w:jc w:val="left"/>
-            </w:pPr>
-            <w:r>
-              <w:rPr>
-                <w:rFonts w:ascii="Arial" w:cs="Arial" w:eastAsia="Arial" w:hAnsi="Arial"/>
-                <w:b/>
-                <w:bCs/>
-                <w:sz w:val="19"/>
-                <w:szCs w:val="19"/>
-              </w:rPr>
-              <w:t xml:space="preserve">BR-05</w:t>
-            </w:r>
-          </w:p>
-        </w:tc>
-        <w:tc>
-          <w:tcPr>
-            <w:tcW w:type="dxa" w:w="4900"/>
+              <w:t xml:space="preserve">3.1 product information (SKU, name, brand, category, species); 3.2 stock levels and reorder points; 3.3 expiration dates and batch/lot numbers; 3.4 supplier purchase order history; 3.5 sales history with date stamps.</w:t>
+            </w:r>
+          </w:p>
+        </w:tc>
+        <w:tc>
+          <w:tcPr>
+            <w:tcW w:type="dxa" w:w="3660"/>
             <w:tcBorders>
               <w:top w:val="single" w:color="A6A6A6" w:sz="4"/>
               <w:left w:val="single" w:color="A6A6A6" w:sz="4"/>
@@ -4983,13 +5017,53 @@
                 <w:sz w:val="19"/>
                 <w:szCs w:val="19"/>
               </w:rPr>
-              <w:t xml:space="preserve">Create purchase orders for low-stock products and send them to the supplier.</w:t>
-            </w:r>
-          </w:p>
-        </w:tc>
-        <w:tc>
-          <w:tcPr>
-            <w:tcW w:type="dxa" w:w="3760"/>
+              <w:t xml:space="preserve">Parts 5, 7 and 9</w:t>
+            </w:r>
+          </w:p>
+        </w:tc>
+      </w:tr>
+      <w:tr>
+        <w:trPr>
+          <w:cantSplit/>
+        </w:trPr>
+        <w:tc>
+          <w:tcPr>
+            <w:tcW w:type="dxa" w:w="700"/>
+            <w:tcBorders>
+              <w:top w:val="single" w:color="A6A6A6" w:sz="4"/>
+              <w:left w:val="single" w:color="A6A6A6" w:sz="4"/>
+              <w:bottom w:val="single" w:color="A6A6A6" w:sz="4"/>
+              <w:right w:val="single" w:color="A6A6A6" w:sz="4"/>
+            </w:tcBorders>
+            <w:shd w:fill="E8F3E5" w:val="clear"/>
+            <w:tcMar>
+              <w:top w:type="dxa" w:w="70"/>
+              <w:left w:type="dxa" w:w="120"/>
+              <w:bottom w:type="dxa" w:w="70"/>
+              <w:right w:type="dxa" w:w="120"/>
+            </w:tcMar>
+            <w:vAlign w:val="top"/>
+          </w:tcPr>
+          <w:p>
+            <w:pPr>
+              <w:spacing w:after="0" w:line="264"/>
+              <w:jc w:val="left"/>
+            </w:pPr>
+            <w:r>
+              <w:rPr>
+                <w:rFonts w:ascii="Arial" w:cs="Arial" w:eastAsia="Arial" w:hAnsi="Arial"/>
+                <w:b/>
+                <w:bCs/>
+                <w:sz w:val="19"/>
+                <w:szCs w:val="19"/>
+              </w:rPr>
+              <w:t xml:space="preserve">4</w:t>
+            </w:r>
+          </w:p>
+        </w:tc>
+        <w:tc>
+          <w:tcPr>
+            <w:tcW w:type="dxa" w:w="5000"/>
             <w:tcBorders>
               <w:top w:val="single" w:color="A6A6A6" w:sz="4"/>
               <w:left w:val="single" w:color="A6A6A6" w:sz="4"/>
@@ -5017,67 +5091,9 @@
                 <w:sz w:val="19"/>
                 <w:szCs w:val="19"/>
               </w:rPr>
-              <w:t xml:space="preserve">Part 5: Reorder</w:t>
-            </w:r>
-          </w:p>
-        </w:tc>
-      </w:tr>
-      <w:tr>
-        <w:trPr>
-          <w:cantSplit/>
-        </w:trPr>
-        <w:tc>
-          <w:tcPr>
-            <w:tcW w:type="dxa" w:w="700"/>
-            <w:tcBorders>
-              <w:top w:val="single" w:color="A6A6A6" w:sz="4"/>
-              <w:left w:val="single" w:color="A6A6A6" w:sz="4"/>
-              <w:bottom w:val="single" w:color="A6A6A6" w:sz="4"/>
-              <w:right w:val="single" w:color="A6A6A6" w:sz="4"/>
-            </w:tcBorders>
-            <w:shd w:fill="E8F3E5" w:val="clear"/>
-            <w:tcMar>
-              <w:top w:type="dxa" w:w="70"/>
-              <w:left w:type="dxa" w:w="120"/>
-              <w:bottom w:type="dxa" w:w="70"/>
-              <w:right w:type="dxa" w:w="120"/>
-            </w:tcMar>
-            <w:vAlign w:val="top"/>
-          </w:tcPr>
-          <w:p>
-            <w:pPr>
-              <w:spacing w:after="0" w:line="264"/>
-              <w:jc w:val="left"/>
-            </w:pPr>
-            <w:r>
-              <w:rPr>
-                <w:rFonts w:ascii="Arial" w:cs="Arial" w:eastAsia="Arial" w:hAnsi="Arial"/>
-                <w:b/>
-                <w:bCs/>
-                <w:sz w:val="19"/>
-                <w:szCs w:val="19"/>
-              </w:rPr>
-              <w:t xml:space="preserve">BR-06</w:t>
-            </w:r>
-          </w:p>
-        </w:tc>
-        <w:tc>
-          <w:tcPr>
-            <w:tcW w:type="dxa" w:w="4900"/>
-            <w:tcBorders>
-              <w:top w:val="single" w:color="A6A6A6" w:sz="4"/>
-              <w:left w:val="single" w:color="A6A6A6" w:sz="4"/>
-              <w:bottom w:val="single" w:color="A6A6A6" w:sz="4"/>
-              <w:right w:val="single" w:color="A6A6A6" w:sz="4"/>
-            </w:tcBorders>
-            <w:tcMar>
-              <w:top w:type="dxa" w:w="70"/>
-              <w:left w:type="dxa" w:w="120"/>
-              <w:bottom w:type="dxa" w:w="70"/>
-              <w:right w:type="dxa" w:w="120"/>
-            </w:tcMar>
-            <w:vAlign w:val="top"/>
-          </w:tcPr>
+              <w:t xml:space="preserve">Predictive analytics and automation:</w:t>
+            </w:r>
+          </w:p>
           <w:p>
             <w:pPr>
               <w:spacing w:after="0" w:line="264"/>
@@ -5091,13 +5107,13 @@
                 <w:sz w:val="19"/>
                 <w:szCs w:val="19"/>
               </w:rPr>
-              <w:t xml:space="preserve">Let suppliers confirm, ship and date the shop's orders themselves.</w:t>
-            </w:r>
-          </w:p>
-        </w:tc>
-        <w:tc>
-          <w:tcPr>
-            <w:tcW w:type="dxa" w:w="3760"/>
+              <w:t xml:space="preserve">4.1 forecasting with Random Forest + Gradient Boosting; 4.2 reorder points from past sales; 4.3 seasonal trends; 4.4 purchase orders when stock reaches the reorder point; 4.5 suppliers notified automatically.</w:t>
+            </w:r>
+          </w:p>
+        </w:tc>
+        <w:tc>
+          <w:tcPr>
+            <w:tcW w:type="dxa" w:w="3660"/>
             <w:tcBorders>
               <w:top w:val="single" w:color="A6A6A6" w:sz="4"/>
               <w:left w:val="single" w:color="A6A6A6" w:sz="4"/>
@@ -5125,7 +5141,7 @@
                 <w:sz w:val="19"/>
                 <w:szCs w:val="19"/>
               </w:rPr>
-              <w:t xml:space="preserve">Part 6: Supplier Portal</w:t>
+              <w:t xml:space="preserve">Part 5 (Reorder emails the supplier); Part 9 (Stock planning)</w:t>
             </w:r>
           </w:p>
         </w:tc>
@@ -5165,13 +5181,13 @@
                 <w:sz w:val="19"/>
                 <w:szCs w:val="19"/>
               </w:rPr>
-              <w:t xml:space="preserve">BR-07</w:t>
-            </w:r>
-          </w:p>
-        </w:tc>
-        <w:tc>
-          <w:tcPr>
-            <w:tcW w:type="dxa" w:w="4900"/>
+              <w:t xml:space="preserve">5</w:t>
+            </w:r>
+          </w:p>
+        </w:tc>
+        <w:tc>
+          <w:tcPr>
+            <w:tcW w:type="dxa" w:w="5000"/>
             <w:tcBorders>
               <w:top w:val="single" w:color="A6A6A6" w:sz="4"/>
               <w:left w:val="single" w:color="A6A6A6" w:sz="4"/>
@@ -5199,27 +5215,9 @@
                 <w:sz w:val="19"/>
                 <w:szCs w:val="19"/>
               </w:rPr>
-              <w:t xml:space="preserve">Rate each supplier from its recorded deliveries, with a stated standard.</w:t>
-            </w:r>
-          </w:p>
-        </w:tc>
-        <w:tc>
-          <w:tcPr>
-            <w:tcW w:type="dxa" w:w="3760"/>
-            <w:tcBorders>
-              <w:top w:val="single" w:color="A6A6A6" w:sz="4"/>
-              <w:left w:val="single" w:color="A6A6A6" w:sz="4"/>
-              <w:bottom w:val="single" w:color="A6A6A6" w:sz="4"/>
-              <w:right w:val="single" w:color="A6A6A6" w:sz="4"/>
-            </w:tcBorders>
-            <w:tcMar>
-              <w:top w:type="dxa" w:w="70"/>
-              <w:left w:type="dxa" w:w="120"/>
-              <w:bottom w:type="dxa" w:w="70"/>
-              <w:right w:type="dxa" w:w="120"/>
-            </w:tcMar>
-            <w:vAlign w:val="top"/>
-          </w:tcPr>
+              <w:t xml:space="preserve">Reports and alerts:</w:t>
+            </w:r>
+          </w:p>
           <w:p>
             <w:pPr>
               <w:spacing w:after="0" w:line="264"/>
@@ -5233,53 +5231,13 @@
                 <w:sz w:val="19"/>
                 <w:szCs w:val="19"/>
               </w:rPr>
-              <w:t xml:space="preserve">Part 7: star rating</w:t>
-            </w:r>
-          </w:p>
-        </w:tc>
-      </w:tr>
-      <w:tr>
-        <w:trPr>
-          <w:cantSplit/>
-        </w:trPr>
-        <w:tc>
-          <w:tcPr>
-            <w:tcW w:type="dxa" w:w="700"/>
-            <w:tcBorders>
-              <w:top w:val="single" w:color="A6A6A6" w:sz="4"/>
-              <w:left w:val="single" w:color="A6A6A6" w:sz="4"/>
-              <w:bottom w:val="single" w:color="A6A6A6" w:sz="4"/>
-              <w:right w:val="single" w:color="A6A6A6" w:sz="4"/>
-            </w:tcBorders>
-            <w:shd w:fill="E8F3E5" w:val="clear"/>
-            <w:tcMar>
-              <w:top w:type="dxa" w:w="70"/>
-              <w:left w:type="dxa" w:w="120"/>
-              <w:bottom w:type="dxa" w:w="70"/>
-              <w:right w:type="dxa" w:w="120"/>
-            </w:tcMar>
-            <w:vAlign w:val="top"/>
-          </w:tcPr>
-          <w:p>
-            <w:pPr>
-              <w:spacing w:after="0" w:line="264"/>
-              <w:jc w:val="left"/>
-            </w:pPr>
-            <w:r>
-              <w:rPr>
-                <w:rFonts w:ascii="Arial" w:cs="Arial" w:eastAsia="Arial" w:hAnsi="Arial"/>
-                <w:b/>
-                <w:bCs/>
-                <w:sz w:val="19"/>
-                <w:szCs w:val="19"/>
-              </w:rPr>
-              <w:t xml:space="preserve">BR-08</w:t>
-            </w:r>
-          </w:p>
-        </w:tc>
-        <w:tc>
-          <w:tcPr>
-            <w:tcW w:type="dxa" w:w="4900"/>
+              <w:t xml:space="preserve">5.1 daily, weekly and monthly reports; 5.2 low-stock alerts; 5.3 alerts for expiry within 30 days, reorder point, stockout and overstock; 5.4 dashboards with charts; 5.5 export.</w:t>
+            </w:r>
+          </w:p>
+        </w:tc>
+        <w:tc>
+          <w:tcPr>
+            <w:tcW w:type="dxa" w:w="3660"/>
             <w:tcBorders>
               <w:top w:val="single" w:color="A6A6A6" w:sz="4"/>
               <w:left w:val="single" w:color="A6A6A6" w:sz="4"/>
@@ -5307,13 +5265,53 @@
                 <w:sz w:val="19"/>
                 <w:szCs w:val="19"/>
               </w:rPr>
-              <w:t xml:space="preserve">Sell at the counter quickly, and update the stock with each sale.</w:t>
-            </w:r>
-          </w:p>
-        </w:tc>
-        <w:tc>
-          <w:tcPr>
-            <w:tcW w:type="dxa" w:w="3760"/>
+              <w:t xml:space="preserve">Part 5 (Dashboard); Part 9 (Reports)</w:t>
+            </w:r>
+          </w:p>
+        </w:tc>
+      </w:tr>
+      <w:tr>
+        <w:trPr>
+          <w:cantSplit/>
+        </w:trPr>
+        <w:tc>
+          <w:tcPr>
+            <w:tcW w:type="dxa" w:w="700"/>
+            <w:tcBorders>
+              <w:top w:val="single" w:color="A6A6A6" w:sz="4"/>
+              <w:left w:val="single" w:color="A6A6A6" w:sz="4"/>
+              <w:bottom w:val="single" w:color="A6A6A6" w:sz="4"/>
+              <w:right w:val="single" w:color="A6A6A6" w:sz="4"/>
+            </w:tcBorders>
+            <w:shd w:fill="E8F3E5" w:val="clear"/>
+            <w:tcMar>
+              <w:top w:type="dxa" w:w="70"/>
+              <w:left w:type="dxa" w:w="120"/>
+              <w:bottom w:type="dxa" w:w="70"/>
+              <w:right w:type="dxa" w:w="120"/>
+            </w:tcMar>
+            <w:vAlign w:val="top"/>
+          </w:tcPr>
+          <w:p>
+            <w:pPr>
+              <w:spacing w:after="0" w:line="264"/>
+              <w:jc w:val="left"/>
+            </w:pPr>
+            <w:r>
+              <w:rPr>
+                <w:rFonts w:ascii="Arial" w:cs="Arial" w:eastAsia="Arial" w:hAnsi="Arial"/>
+                <w:b/>
+                <w:bCs/>
+                <w:sz w:val="19"/>
+                <w:szCs w:val="19"/>
+              </w:rPr>
+              <w:t xml:space="preserve">6</w:t>
+            </w:r>
+          </w:p>
+        </w:tc>
+        <w:tc>
+          <w:tcPr>
+            <w:tcW w:type="dxa" w:w="5000"/>
             <w:tcBorders>
               <w:top w:val="single" w:color="A6A6A6" w:sz="4"/>
               <w:left w:val="single" w:color="A6A6A6" w:sz="4"/>
@@ -5341,67 +5339,9 @@
                 <w:sz w:val="19"/>
                 <w:szCs w:val="19"/>
               </w:rPr>
-              <w:t xml:space="preserve">Part 8: Point of Sale</w:t>
-            </w:r>
-          </w:p>
-        </w:tc>
-      </w:tr>
-      <w:tr>
-        <w:trPr>
-          <w:cantSplit/>
-        </w:trPr>
-        <w:tc>
-          <w:tcPr>
-            <w:tcW w:type="dxa" w:w="700"/>
-            <w:tcBorders>
-              <w:top w:val="single" w:color="A6A6A6" w:sz="4"/>
-              <w:left w:val="single" w:color="A6A6A6" w:sz="4"/>
-              <w:bottom w:val="single" w:color="A6A6A6" w:sz="4"/>
-              <w:right w:val="single" w:color="A6A6A6" w:sz="4"/>
-            </w:tcBorders>
-            <w:shd w:fill="E8F3E5" w:val="clear"/>
-            <w:tcMar>
-              <w:top w:type="dxa" w:w="70"/>
-              <w:left w:type="dxa" w:w="120"/>
-              <w:bottom w:type="dxa" w:w="70"/>
-              <w:right w:type="dxa" w:w="120"/>
-            </w:tcMar>
-            <w:vAlign w:val="top"/>
-          </w:tcPr>
-          <w:p>
-            <w:pPr>
-              <w:spacing w:after="0" w:line="264"/>
-              <w:jc w:val="left"/>
-            </w:pPr>
-            <w:r>
-              <w:rPr>
-                <w:rFonts w:ascii="Arial" w:cs="Arial" w:eastAsia="Arial" w:hAnsi="Arial"/>
-                <w:b/>
-                <w:bCs/>
-                <w:sz w:val="19"/>
-                <w:szCs w:val="19"/>
-              </w:rPr>
-              <w:t xml:space="preserve">BR-09</w:t>
-            </w:r>
-          </w:p>
-        </w:tc>
-        <w:tc>
-          <w:tcPr>
-            <w:tcW w:type="dxa" w:w="4900"/>
-            <w:tcBorders>
-              <w:top w:val="single" w:color="A6A6A6" w:sz="4"/>
-              <w:left w:val="single" w:color="A6A6A6" w:sz="4"/>
-              <w:bottom w:val="single" w:color="A6A6A6" w:sz="4"/>
-              <w:right w:val="single" w:color="A6A6A6" w:sz="4"/>
-            </w:tcBorders>
-            <w:tcMar>
-              <w:top w:type="dxa" w:w="70"/>
-              <w:left w:type="dxa" w:w="120"/>
-              <w:bottom w:type="dxa" w:w="70"/>
-              <w:right w:type="dxa" w:w="120"/>
-            </w:tcMar>
-            <w:vAlign w:val="top"/>
-          </w:tcPr>
+              <w:t xml:space="preserve">Data quality and business rules:</w:t>
+            </w:r>
+          </w:p>
           <w:p>
             <w:pPr>
               <w:spacing w:after="0" w:line="264"/>
@@ -5415,13 +5355,13 @@
                 <w:sz w:val="19"/>
                 <w:szCs w:val="19"/>
               </w:rPr>
-              <w:t xml:space="preserve">Control the cash: starting cash, cash in and out, and the end-of-day count.</w:t>
-            </w:r>
-          </w:p>
-        </w:tc>
-        <w:tc>
-          <w:tcPr>
-            <w:tcW w:type="dxa" w:w="3760"/>
+              <w:t xml:space="preserve">6.1 expired products cannot be sold; 6.2 every entry validated (format, range, consistency); 6.3 data integrity; 6.4 audit trail of changes.</w:t>
+            </w:r>
+          </w:p>
+        </w:tc>
+        <w:tc>
+          <w:tcPr>
+            <w:tcW w:type="dxa" w:w="3660"/>
             <w:tcBorders>
               <w:top w:val="single" w:color="A6A6A6" w:sz="4"/>
               <w:left w:val="single" w:color="A6A6A6" w:sz="4"/>
@@ -5449,7 +5389,7 @@
                 <w:sz w:val="19"/>
                 <w:szCs w:val="19"/>
               </w:rPr>
-              <w:t xml:space="preserve">Parts 8 and 9</w:t>
+              <w:t xml:space="preserve">Part 5 (the product form); Part 8 (the till); Part 9 (Activity log)</w:t>
             </w:r>
           </w:p>
         </w:tc>
@@ -5489,13 +5429,13 @@
                 <w:sz w:val="19"/>
                 <w:szCs w:val="19"/>
               </w:rPr>
-              <w:t xml:space="preserve">BR-10</w:t>
-            </w:r>
-          </w:p>
-        </w:tc>
-        <w:tc>
-          <w:tcPr>
-            <w:tcW w:type="dxa" w:w="4900"/>
+              <w:t xml:space="preserve">7</w:t>
+            </w:r>
+          </w:p>
+        </w:tc>
+        <w:tc>
+          <w:tcPr>
+            <w:tcW w:type="dxa" w:w="5000"/>
             <w:tcBorders>
               <w:top w:val="single" w:color="A6A6A6" w:sz="4"/>
               <w:left w:val="single" w:color="A6A6A6" w:sz="4"/>
@@ -5523,27 +5463,9 @@
                 <w:sz w:val="19"/>
                 <w:szCs w:val="19"/>
               </w:rPr>
-              <w:t xml:space="preserve">Correct mistakes safely: a cashier asks, the administrator voids, and stock returns.</w:t>
-            </w:r>
-          </w:p>
-        </w:tc>
-        <w:tc>
-          <w:tcPr>
-            <w:tcW w:type="dxa" w:w="3760"/>
-            <w:tcBorders>
-              <w:top w:val="single" w:color="A6A6A6" w:sz="4"/>
-              <w:left w:val="single" w:color="A6A6A6" w:sz="4"/>
-              <w:bottom w:val="single" w:color="A6A6A6" w:sz="4"/>
-              <w:right w:val="single" w:color="A6A6A6" w:sz="4"/>
-            </w:tcBorders>
-            <w:tcMar>
-              <w:top w:type="dxa" w:w="70"/>
-              <w:left w:type="dxa" w:w="120"/>
-              <w:bottom w:type="dxa" w:w="70"/>
-              <w:right w:type="dxa" w:w="120"/>
-            </w:tcMar>
-            <w:vAlign w:val="top"/>
-          </w:tcPr>
+              <w:t xml:space="preserve">Technical and integration:</w:t>
+            </w:r>
+          </w:p>
           <w:p>
             <w:pPr>
               <w:spacing w:after="0" w:line="264"/>
@@ -5557,53 +5479,13 @@
                 <w:sz w:val="19"/>
                 <w:szCs w:val="19"/>
               </w:rPr>
-              <w:t xml:space="preserve">Parts 8 and 9</w:t>
-            </w:r>
-          </w:p>
-        </w:tc>
-      </w:tr>
-      <w:tr>
-        <w:trPr>
-          <w:cantSplit/>
-        </w:trPr>
-        <w:tc>
-          <w:tcPr>
-            <w:tcW w:type="dxa" w:w="700"/>
-            <w:tcBorders>
-              <w:top w:val="single" w:color="A6A6A6" w:sz="4"/>
-              <w:left w:val="single" w:color="A6A6A6" w:sz="4"/>
-              <w:bottom w:val="single" w:color="A6A6A6" w:sz="4"/>
-              <w:right w:val="single" w:color="A6A6A6" w:sz="4"/>
-            </w:tcBorders>
-            <w:shd w:fill="E8F3E5" w:val="clear"/>
-            <w:tcMar>
-              <w:top w:type="dxa" w:w="70"/>
-              <w:left w:type="dxa" w:w="120"/>
-              <w:bottom w:type="dxa" w:w="70"/>
-              <w:right w:type="dxa" w:w="120"/>
-            </w:tcMar>
-            <w:vAlign w:val="top"/>
-          </w:tcPr>
-          <w:p>
-            <w:pPr>
-              <w:spacing w:after="0" w:line="264"/>
-              <w:jc w:val="left"/>
-            </w:pPr>
-            <w:r>
-              <w:rPr>
-                <w:rFonts w:ascii="Arial" w:cs="Arial" w:eastAsia="Arial" w:hAnsi="Arial"/>
-                <w:b/>
-                <w:bCs/>
-                <w:sz w:val="19"/>
-                <w:szCs w:val="19"/>
-              </w:rPr>
-              <w:t xml:space="preserve">BR-11</w:t>
-            </w:r>
-          </w:p>
-        </w:tc>
-        <w:tc>
-          <w:tcPr>
-            <w:tcW w:type="dxa" w:w="4900"/>
+              <w:t xml:space="preserve">7.1 barcode scanner; 7.2 thermal receipt printer; 7.3 automated daily backups; 7.4 MySQL database.</w:t>
+            </w:r>
+          </w:p>
+        </w:tc>
+        <w:tc>
+          <w:tcPr>
+            <w:tcW w:type="dxa" w:w="3660"/>
             <w:tcBorders>
               <w:top w:val="single" w:color="A6A6A6" w:sz="4"/>
               <w:left w:val="single" w:color="A6A6A6" w:sz="4"/>
@@ -5631,257 +5513,7 @@
                 <w:sz w:val="19"/>
                 <w:szCs w:val="19"/>
               </w:rPr>
-              <w:t xml:space="preserve">Forecast demand and recommend what to reorder, showing how accurate the forecast is.</w:t>
-            </w:r>
-          </w:p>
-        </w:tc>
-        <w:tc>
-          <w:tcPr>
-            <w:tcW w:type="dxa" w:w="3760"/>
-            <w:tcBorders>
-              <w:top w:val="single" w:color="A6A6A6" w:sz="4"/>
-              <w:left w:val="single" w:color="A6A6A6" w:sz="4"/>
-              <w:bottom w:val="single" w:color="A6A6A6" w:sz="4"/>
-              <w:right w:val="single" w:color="A6A6A6" w:sz="4"/>
-            </w:tcBorders>
-            <w:tcMar>
-              <w:top w:type="dxa" w:w="70"/>
-              <w:left w:type="dxa" w:w="120"/>
-              <w:bottom w:type="dxa" w:w="70"/>
-              <w:right w:type="dxa" w:w="120"/>
-            </w:tcMar>
-            <w:vAlign w:val="top"/>
-          </w:tcPr>
-          <w:p>
-            <w:pPr>
-              <w:spacing w:after="0" w:line="264"/>
-              <w:jc w:val="left"/>
-            </w:pPr>
-            <w:r>
-              <w:rPr>
-                <w:rFonts w:ascii="Arial" w:cs="Arial" w:eastAsia="Arial" w:hAnsi="Arial"/>
-                <w:b w:val="false"/>
-                <w:bCs w:val="false"/>
-                <w:sz w:val="19"/>
-                <w:szCs w:val="19"/>
-              </w:rPr>
-              <w:t xml:space="preserve">Part 9: Stock planning</w:t>
-            </w:r>
-          </w:p>
-        </w:tc>
-      </w:tr>
-      <w:tr>
-        <w:trPr>
-          <w:cantSplit/>
-        </w:trPr>
-        <w:tc>
-          <w:tcPr>
-            <w:tcW w:type="dxa" w:w="700"/>
-            <w:tcBorders>
-              <w:top w:val="single" w:color="A6A6A6" w:sz="4"/>
-              <w:left w:val="single" w:color="A6A6A6" w:sz="4"/>
-              <w:bottom w:val="single" w:color="A6A6A6" w:sz="4"/>
-              <w:right w:val="single" w:color="A6A6A6" w:sz="4"/>
-            </w:tcBorders>
-            <w:shd w:fill="E8F3E5" w:val="clear"/>
-            <w:tcMar>
-              <w:top w:type="dxa" w:w="70"/>
-              <w:left w:type="dxa" w:w="120"/>
-              <w:bottom w:type="dxa" w:w="70"/>
-              <w:right w:type="dxa" w:w="120"/>
-            </w:tcMar>
-            <w:vAlign w:val="top"/>
-          </w:tcPr>
-          <w:p>
-            <w:pPr>
-              <w:spacing w:after="0" w:line="264"/>
-              <w:jc w:val="left"/>
-            </w:pPr>
-            <w:r>
-              <w:rPr>
-                <w:rFonts w:ascii="Arial" w:cs="Arial" w:eastAsia="Arial" w:hAnsi="Arial"/>
-                <w:b/>
-                <w:bCs/>
-                <w:sz w:val="19"/>
-                <w:szCs w:val="19"/>
-              </w:rPr>
-              <w:t xml:space="preserve">BR-12</w:t>
-            </w:r>
-          </w:p>
-        </w:tc>
-        <w:tc>
-          <w:tcPr>
-            <w:tcW w:type="dxa" w:w="4900"/>
-            <w:tcBorders>
-              <w:top w:val="single" w:color="A6A6A6" w:sz="4"/>
-              <w:left w:val="single" w:color="A6A6A6" w:sz="4"/>
-              <w:bottom w:val="single" w:color="A6A6A6" w:sz="4"/>
-              <w:right w:val="single" w:color="A6A6A6" w:sz="4"/>
-            </w:tcBorders>
-            <w:tcMar>
-              <w:top w:type="dxa" w:w="70"/>
-              <w:left w:type="dxa" w:w="120"/>
-              <w:bottom w:type="dxa" w:w="70"/>
-              <w:right w:type="dxa" w:w="120"/>
-            </w:tcMar>
-            <w:vAlign w:val="top"/>
-          </w:tcPr>
-          <w:p>
-            <w:pPr>
-              <w:spacing w:after="0" w:line="264"/>
-              <w:jc w:val="left"/>
-            </w:pPr>
-            <w:r>
-              <w:rPr>
-                <w:rFonts w:ascii="Arial" w:cs="Arial" w:eastAsia="Arial" w:hAnsi="Arial"/>
-                <w:b w:val="false"/>
-                <w:bCs w:val="false"/>
-                <w:sz w:val="19"/>
-                <w:szCs w:val="19"/>
-              </w:rPr>
-              <w:t xml:space="preserve">Give each role only the pages and records it needs, and keep a log of changes.</w:t>
-            </w:r>
-          </w:p>
-        </w:tc>
-        <w:tc>
-          <w:tcPr>
-            <w:tcW w:type="dxa" w:w="3760"/>
-            <w:tcBorders>
-              <w:top w:val="single" w:color="A6A6A6" w:sz="4"/>
-              <w:left w:val="single" w:color="A6A6A6" w:sz="4"/>
-              <w:bottom w:val="single" w:color="A6A6A6" w:sz="4"/>
-              <w:right w:val="single" w:color="A6A6A6" w:sz="4"/>
-            </w:tcBorders>
-            <w:tcMar>
-              <w:top w:type="dxa" w:w="70"/>
-              <w:left w:type="dxa" w:w="120"/>
-              <w:bottom w:type="dxa" w:w="70"/>
-              <w:right w:type="dxa" w:w="120"/>
-            </w:tcMar>
-            <w:vAlign w:val="top"/>
-          </w:tcPr>
-          <w:p>
-            <w:pPr>
-              <w:spacing w:after="0" w:line="264"/>
-              <w:jc w:val="left"/>
-            </w:pPr>
-            <w:r>
-              <w:rPr>
-                <w:rFonts w:ascii="Arial" w:cs="Arial" w:eastAsia="Arial" w:hAnsi="Arial"/>
-                <w:b w:val="false"/>
-                <w:bCs w:val="false"/>
-                <w:sz w:val="19"/>
-                <w:szCs w:val="19"/>
-              </w:rPr>
-              <w:t xml:space="preserve">Parts 6 and 8; Activity log</w:t>
-            </w:r>
-          </w:p>
-        </w:tc>
-      </w:tr>
-      <w:tr>
-        <w:trPr>
-          <w:cantSplit/>
-        </w:trPr>
-        <w:tc>
-          <w:tcPr>
-            <w:tcW w:type="dxa" w:w="700"/>
-            <w:tcBorders>
-              <w:top w:val="single" w:color="A6A6A6" w:sz="4"/>
-              <w:left w:val="single" w:color="A6A6A6" w:sz="4"/>
-              <w:bottom w:val="single" w:color="A6A6A6" w:sz="4"/>
-              <w:right w:val="single" w:color="A6A6A6" w:sz="4"/>
-            </w:tcBorders>
-            <w:shd w:fill="E8F3E5" w:val="clear"/>
-            <w:tcMar>
-              <w:top w:type="dxa" w:w="70"/>
-              <w:left w:type="dxa" w:w="120"/>
-              <w:bottom w:type="dxa" w:w="70"/>
-              <w:right w:type="dxa" w:w="120"/>
-            </w:tcMar>
-            <w:vAlign w:val="top"/>
-          </w:tcPr>
-          <w:p>
-            <w:pPr>
-              <w:spacing w:after="0" w:line="264"/>
-              <w:jc w:val="left"/>
-            </w:pPr>
-            <w:r>
-              <w:rPr>
-                <w:rFonts w:ascii="Arial" w:cs="Arial" w:eastAsia="Arial" w:hAnsi="Arial"/>
-                <w:b/>
-                <w:bCs/>
-                <w:sz w:val="19"/>
-                <w:szCs w:val="19"/>
-              </w:rPr>
-              <w:t xml:space="preserve">BR-13</w:t>
-            </w:r>
-          </w:p>
-        </w:tc>
-        <w:tc>
-          <w:tcPr>
-            <w:tcW w:type="dxa" w:w="4900"/>
-            <w:tcBorders>
-              <w:top w:val="single" w:color="A6A6A6" w:sz="4"/>
-              <w:left w:val="single" w:color="A6A6A6" w:sz="4"/>
-              <w:bottom w:val="single" w:color="A6A6A6" w:sz="4"/>
-              <w:right w:val="single" w:color="A6A6A6" w:sz="4"/>
-            </w:tcBorders>
-            <w:tcMar>
-              <w:top w:type="dxa" w:w="70"/>
-              <w:left w:type="dxa" w:w="120"/>
-              <w:bottom w:type="dxa" w:w="70"/>
-              <w:right w:type="dxa" w:w="120"/>
-            </w:tcMar>
-            <w:vAlign w:val="top"/>
-          </w:tcPr>
-          <w:p>
-            <w:pPr>
-              <w:spacing w:after="0" w:line="264"/>
-              <w:jc w:val="left"/>
-            </w:pPr>
-            <w:r>
-              <w:rPr>
-                <w:rFonts w:ascii="Arial" w:cs="Arial" w:eastAsia="Arial" w:hAnsi="Arial"/>
-                <w:b w:val="false"/>
-                <w:bCs w:val="false"/>
-                <w:sz w:val="19"/>
-                <w:szCs w:val="19"/>
-              </w:rPr>
-              <w:t xml:space="preserve">Report sales by period and export the data.</w:t>
-            </w:r>
-          </w:p>
-        </w:tc>
-        <w:tc>
-          <w:tcPr>
-            <w:tcW w:type="dxa" w:w="3760"/>
-            <w:tcBorders>
-              <w:top w:val="single" w:color="A6A6A6" w:sz="4"/>
-              <w:left w:val="single" w:color="A6A6A6" w:sz="4"/>
-              <w:bottom w:val="single" w:color="A6A6A6" w:sz="4"/>
-              <w:right w:val="single" w:color="A6A6A6" w:sz="4"/>
-            </w:tcBorders>
-            <w:tcMar>
-              <w:top w:type="dxa" w:w="70"/>
-              <w:left w:type="dxa" w:w="120"/>
-              <w:bottom w:type="dxa" w:w="70"/>
-              <w:right w:type="dxa" w:w="120"/>
-            </w:tcMar>
-            <w:vAlign w:val="top"/>
-          </w:tcPr>
-          <w:p>
-            <w:pPr>
-              <w:spacing w:after="0" w:line="264"/>
-              <w:jc w:val="left"/>
-            </w:pPr>
-            <w:r>
-              <w:rPr>
-                <w:rFonts w:ascii="Arial" w:cs="Arial" w:eastAsia="Arial" w:hAnsi="Arial"/>
-                <w:b w:val="false"/>
-                <w:bCs w:val="false"/>
-                <w:sz w:val="19"/>
-                <w:szCs w:val="19"/>
-              </w:rPr>
-              <w:t xml:space="preserve">Part 9: Reports</w:t>
+              <w:t xml:space="preserve">Part 8 (scan and receipt); backups run daily by themselves</w:t>
             </w:r>
           </w:p>
         </w:tc>
@@ -5908,7 +5540,7 @@
           <w:sz w:val="24"/>
           <w:szCs w:val="24"/>
         </w:rPr>
-        <w:t xml:space="preserve">Non-functional requirements</w:t>
+        <w:t xml:space="preserve">Added during development</w:t>
       </w:r>
     </w:p>
     <w:p>
@@ -5926,7 +5558,7 @@
           <w:sz w:val="21"/>
           <w:szCs w:val="21"/>
         </w:rPr>
-        <w:t xml:space="preserve">Works in a web browser on a laptop and a phone, with no installation.</w:t>
+        <w:t xml:space="preserve">The Supplier Portal, where suppliers confirm, ship and date the shop's orders (part of the supplier management in Objective 1).</w:t>
       </w:r>
     </w:p>
     <w:p>
@@ -5944,7 +5576,7 @@
           <w:sz w:val="21"/>
           <w:szCs w:val="21"/>
         </w:rPr>
-        <w:t xml:space="preserve">The counter is never slowed down: one screen, cash payment, the receipt prints after the sale.</w:t>
+        <w:t xml:space="preserve">A star rating for each supplier, from its recorded deliveries.</w:t>
       </w:r>
     </w:p>
     <w:p>
@@ -5962,7 +5594,7 @@
           <w:sz w:val="21"/>
           <w:szCs w:val="21"/>
         </w:rPr>
-        <w:t xml:space="preserve">Secure: each person signs in; passwords must be strong; repeated wrong passwords lock the sign-in for a while.</w:t>
+        <w:t xml:space="preserve">Cash control at the counter: starting cash, cash in and out, and the end-of-day count.</w:t>
       </w:r>
     </w:p>
     <w:p>
@@ -5980,7 +5612,7 @@
           <w:sz w:val="21"/>
           <w:szCs w:val="21"/>
         </w:rPr>
-        <w:t xml:space="preserve">Honest numbers: the forecast shows its own measured accuracy.</w:t>
+        <w:t xml:space="preserve">Void requests: a cashier asks, the administrator decides.</w:t>
       </w:r>
     </w:p>
     <w:p>
@@ -6293,7 +5925,7 @@
                 <w:sz w:val="18"/>
                 <w:szCs w:val="18"/>
               </w:rPr>
-              <w:t xml:space="preserve">Restock Needed and Expiring Soon — this is BR-04.</w:t>
+              <w:t xml:space="preserve">Restock Needed and Expiring Soon, and the charts — BR 5.2 to 5.4.</w:t>
             </w:r>
           </w:p>
           <w:p>
@@ -6733,7 +6365,7 @@
                 <w:sz w:val="20"/>
                 <w:szCs w:val="20"/>
               </w:rPr>
-              <w:t xml:space="preserve">"To add a product, the form asks only for what the shop needs. If we save it empty, each required field says exactly what is missing, and the cursor goes to the first one. This is BR-02: no wrong or missing data is saved."</w:t>
+              <w:t xml:space="preserve">"To add a product, the form asks only for what the shop needs. If we save it empty, each required field says exactly what is missing, and the cursor goes to the first one. This is BR 6.2: every entry is validated, so no wrong or missing data is saved."</w:t>
             </w:r>
           </w:p>
         </w:tc>
@@ -7035,7 +6667,7 @@
                 <w:sz w:val="20"/>
                 <w:szCs w:val="20"/>
               </w:rPr>
-              <w:t xml:space="preserve">"The SKU is not typed. We choose the product type, and the system makes the SKU from it with the shop's running number — here it shows the next one. Once saved, the SKU never changes. This is BR-03: every code follows one pattern."</w:t>
+              <w:t xml:space="preserve">"The SKU is not typed. We choose the product type, and the system makes the SKU from it with the shop's running number — here it shows the next one. Once saved, the SKU never changes, and two products can never share one. This is BR 2.5 and 3.1."</w:t>
             </w:r>
           </w:p>
         </w:tc>
@@ -7641,7 +7273,7 @@
                 <w:sz w:val="20"/>
                 <w:szCs w:val="20"/>
               </w:rPr>
-              <w:t xml:space="preserve">"With correct values the product is saved, and the confirmation shows the SKU it was given. This is BR-01."</w:t>
+              <w:t xml:space="preserve">"With correct values the product is saved, and the confirmation shows the SKU it was given. This is BR 2.1 and 3."</w:t>
             </w:r>
           </w:p>
         </w:tc>
@@ -7929,7 +7561,7 @@
                 <w:sz w:val="20"/>
                 <w:szCs w:val="20"/>
               </w:rPr>
-              <w:t xml:space="preserve">"Stock changes are recorded with a reason. For a product that has already expired, the system asks for the new batch's expiration date, and the expired units are removed and replaced, not added on top."</w:t>
+              <w:t xml:space="preserve">"Stock changes are recorded with a reason. For a product that has already expired, the system asks for the new batch's expiration date, and the expired units are removed and replaced, not added on top. This is BR 3.3 and 6.1."</w:t>
             </w:r>
           </w:p>
         </w:tc>
@@ -8217,7 +7849,7 @@
                 <w:sz w:val="20"/>
                 <w:szCs w:val="20"/>
               </w:rPr>
-              <w:t xml:space="preserve">"Reorder lists the products at or below their reorder level. With one confirmation, FETCH creates the purchase orders and emails each one to its supplier. This is BR-05."</w:t>
+              <w:t xml:space="preserve">"Reorder lists the products at or below their reorder level. With one confirmation, FETCH creates the purchase orders and emails each one to its supplier. This is BR 4.4 and 4.5."</w:t>
             </w:r>
           </w:p>
         </w:tc>
@@ -8524,7 +8156,7 @@
                 <w:sz w:val="20"/>
                 <w:szCs w:val="20"/>
               </w:rPr>
-              <w:t xml:space="preserve">"Now we are the supplier. The supplier has its own portal and sees only its own orders and products — never the shop's sales or other suppliers. This is BR-06 and BR-12."</w:t>
+              <w:t xml:space="preserve">"Now we are the supplier. The supplier has its own portal and sees only its own orders and products — never the shop's sales or other suppliers. This is the supplier management in our first objective, and BR 1.3."</w:t>
             </w:r>
           </w:p>
           <w:p>
@@ -9615,7 +9247,7 @@
                 <w:sz w:val="20"/>
                 <w:szCs w:val="20"/>
               </w:rPr>
-              <w:t xml:space="preserve">"A supplier meets the shop's standard at 4 stars or more. The supplier sees the same rating on its own portal. This is BR-07."</w:t>
+              <w:t xml:space="preserve">"A supplier meets the shop's standard at 4 stars or more. The supplier sees the same rating on its own portal."</w:t>
             </w:r>
           </w:p>
         </w:tc>
@@ -9922,7 +9554,7 @@
                 <w:sz w:val="20"/>
                 <w:szCs w:val="20"/>
               </w:rPr>
-              <w:t xml:space="preserve">"This is the Point of Sale, the only page the cashier uses. The cashier's name and the date are at the top. If the cashier tries to open another page, FETCH brings them back here. This is BR-12."</w:t>
+              <w:t xml:space="preserve">"This is the Point of Sale, the only page the cashier uses. The cashier's name and the date are at the top. If the cashier tries to open another page, FETCH brings them back here. This is BR 1.2 and 1.3."</w:t>
             </w:r>
           </w:p>
           <w:p>
@@ -9936,7 +9568,7 @@
                 <w:sz w:val="20"/>
                 <w:szCs w:val="20"/>
               </w:rPr>
-              <w:t xml:space="preserve">"Expired and sold-out products are not among the product cards; they sit under "Can't be sold", so they cannot be sold by mistake."</w:t>
+              <w:t xml:space="preserve">"Expired and sold-out products are not among the product cards; they sit under "Can't be sold", so they cannot be sold by mistake. This is BR 6.1."</w:t>
             </w:r>
           </w:p>
         </w:tc>
@@ -10001,7 +9633,7 @@
                 <w:sz w:val="18"/>
                 <w:szCs w:val="18"/>
               </w:rPr>
-              <w:t xml:space="preserve">8.2   SPEAKER 1 — Juan Carlo</w:t>
+              <w:t xml:space="preserve">8.1b ★   SPEAKER 1 — Juan Carlo</w:t>
             </w:r>
           </w:p>
         </w:tc>
@@ -10075,21 +9707,7 @@
                 <w:sz w:val="19"/>
                 <w:szCs w:val="19"/>
               </w:rPr>
-              <w:t xml:space="preserve">Click Charge with the cart empty.</w:t>
-            </w:r>
-          </w:p>
-          <w:p>
-            <w:pPr>
-              <w:spacing w:after="0" w:line="264"/>
-              <w:jc w:val="left"/>
-            </w:pPr>
-            <w:r>
-              <w:rPr>
-                <w:rFonts w:ascii="Arial" w:cs="Arial" w:eastAsia="Arial" w:hAnsi="Arial"/>
-                <w:sz w:val="19"/>
-                <w:szCs w:val="19"/>
-              </w:rPr>
-              <w:t xml:space="preserve">Click a product card. Enter less cash than the total and click Charge.</w:t>
+              <w:t xml:space="preserve">If the barcode scanner is connected: press F2 and scan a product.</w:t>
             </w:r>
           </w:p>
         </w:tc>
@@ -10162,99 +9780,7 @@
                 <w:sz w:val="20"/>
                 <w:szCs w:val="20"/>
               </w:rPr>
-              <w:t xml:space="preserve">"The till checks every step as well. An empty cart cannot be charged, and if the customer gives less cash than the total, the sale does not go through."</w:t>
-            </w:r>
-          </w:p>
-        </w:tc>
-      </w:tr>
-      <w:tr>
-        <w:trPr>
-          <w:cantSplit/>
-        </w:trPr>
-        <w:tc>
-          <w:tcPr>
-            <w:tcW w:type="dxa" w:w="1300"/>
-            <w:tcBorders>
-              <w:top w:val="single" w:color="A6A6A6" w:sz="4"/>
-              <w:left w:val="single" w:color="A6A6A6" w:sz="4"/>
-              <w:bottom w:val="single" w:color="A6A6A6" w:sz="4"/>
-              <w:right w:val="single" w:color="A6A6A6" w:sz="4"/>
-            </w:tcBorders>
-            <w:shd w:fill="EEEEEE" w:val="clear"/>
-            <w:tcMar>
-              <w:top w:type="dxa" w:w="70"/>
-              <w:left w:type="dxa" w:w="120"/>
-              <w:bottom w:type="dxa" w:w="70"/>
-              <w:right w:type="dxa" w:w="120"/>
-            </w:tcMar>
-            <w:vAlign w:val="top"/>
-          </w:tcPr>
-          <w:p>
-            <w:pPr>
-              <w:spacing w:after="0" w:line="264"/>
-              <w:jc w:val="left"/>
-            </w:pPr>
-            <w:r>
-              <w:rPr>
-                <w:rFonts w:ascii="Arial" w:cs="Arial" w:eastAsia="Arial" w:hAnsi="Arial"/>
-                <w:b/>
-                <w:bCs/>
-                <w:color w:val="444444"/>
-                <w:sz w:val="17"/>
-                <w:szCs w:val="17"/>
-              </w:rPr>
-              <w:t xml:space="preserve">POINT AT</w:t>
-            </w:r>
-          </w:p>
-        </w:tc>
-        <w:tc>
-          <w:tcPr>
-            <w:tcW w:type="dxa" w:w="8060"/>
-            <w:tcBorders>
-              <w:top w:val="single" w:color="A6A6A6" w:sz="4"/>
-              <w:left w:val="single" w:color="A6A6A6" w:sz="4"/>
-              <w:bottom w:val="single" w:color="A6A6A6" w:sz="4"/>
-              <w:right w:val="single" w:color="A6A6A6" w:sz="4"/>
-            </w:tcBorders>
-            <w:shd w:fill="F7F7F7" w:val="clear"/>
-            <w:tcMar>
-              <w:top w:type="dxa" w:w="70"/>
-              <w:left w:type="dxa" w:w="120"/>
-              <w:bottom w:type="dxa" w:w="70"/>
-              <w:right w:type="dxa" w:w="120"/>
-            </w:tcMar>
-            <w:vAlign w:val="top"/>
-          </w:tcPr>
-          <w:p>
-            <w:pPr>
-              <w:spacing w:after="0" w:line="264"/>
-              <w:jc w:val="left"/>
-            </w:pPr>
-            <w:r>
-              <w:rPr>
-                <w:rFonts w:ascii="Arial" w:cs="Arial" w:eastAsia="Arial" w:hAnsi="Arial"/>
-                <w:i/>
-                <w:iCs/>
-                <w:sz w:val="18"/>
-                <w:szCs w:val="18"/>
-              </w:rPr>
-              <w:t xml:space="preserve">"Cart is empty"</w:t>
-            </w:r>
-          </w:p>
-          <w:p>
-            <w:pPr>
-              <w:spacing w:after="0" w:line="264"/>
-              <w:jc w:val="left"/>
-            </w:pPr>
-            <w:r>
-              <w:rPr>
-                <w:rFonts w:ascii="Arial" w:cs="Arial" w:eastAsia="Arial" w:hAnsi="Arial"/>
-                <w:i/>
-                <w:iCs/>
-                <w:sz w:val="18"/>
-                <w:szCs w:val="18"/>
-              </w:rPr>
-              <w:t xml:space="preserve">"Insufficient cash — customer gave less than the total"</w:t>
+              <w:t xml:space="preserve">"Products can be added by scanning their barcode, which is faster and avoids picking the wrong item. This is BR 2.3 and 7.1."</w:t>
             </w:r>
           </w:p>
         </w:tc>
@@ -10319,7 +9845,7 @@
                 <w:sz w:val="18"/>
                 <w:szCs w:val="18"/>
               </w:rPr>
-              <w:t xml:space="preserve">8.3   SPEAKER 1 — Juan Carlo</w:t>
+              <w:t xml:space="preserve">8.2   SPEAKER 1 — Juan Carlo</w:t>
             </w:r>
           </w:p>
         </w:tc>
@@ -10393,7 +9919,21 @@
                 <w:sz w:val="19"/>
                 <w:szCs w:val="19"/>
               </w:rPr>
-              <w:t xml:space="preserve">Enter enough cash, click Charge, then Complete sale.</w:t>
+              <w:t xml:space="preserve">Click Charge with the cart empty.</w:t>
+            </w:r>
+          </w:p>
+          <w:p>
+            <w:pPr>
+              <w:spacing w:after="0" w:line="264"/>
+              <w:jc w:val="left"/>
+            </w:pPr>
+            <w:r>
+              <w:rPr>
+                <w:rFonts w:ascii="Arial" w:cs="Arial" w:eastAsia="Arial" w:hAnsi="Arial"/>
+                <w:sz w:val="19"/>
+                <w:szCs w:val="19"/>
+              </w:rPr>
+              <w:t xml:space="preserve">Click a product card. Enter less cash than the total and click Charge.</w:t>
             </w:r>
           </w:p>
         </w:tc>
@@ -10466,7 +10006,7 @@
                 <w:sz w:val="20"/>
                 <w:szCs w:val="20"/>
               </w:rPr>
-              <w:t xml:space="preserve">"With enough cash, the sale is completed: the change is shown, the receipt prints, and the stock goes down at once. This is BR-08."</w:t>
+              <w:t xml:space="preserve">"The till checks every step as well. An empty cart cannot be charged, and if the customer gives less cash than the total, the sale does not go through."</w:t>
             </w:r>
           </w:p>
         </w:tc>
@@ -10542,7 +10082,23 @@
                 <w:sz w:val="18"/>
                 <w:szCs w:val="18"/>
               </w:rPr>
-              <w:t xml:space="preserve">"Sale completed! Change: ₱…"</w:t>
+              <w:t xml:space="preserve">"Cart is empty"</w:t>
+            </w:r>
+          </w:p>
+          <w:p>
+            <w:pPr>
+              <w:spacing w:after="0" w:line="264"/>
+              <w:jc w:val="left"/>
+            </w:pPr>
+            <w:r>
+              <w:rPr>
+                <w:rFonts w:ascii="Arial" w:cs="Arial" w:eastAsia="Arial" w:hAnsi="Arial"/>
+                <w:i/>
+                <w:iCs/>
+                <w:sz w:val="18"/>
+                <w:szCs w:val="18"/>
+              </w:rPr>
+              <w:t xml:space="preserve">"Insufficient cash — customer gave less than the total"</w:t>
             </w:r>
           </w:p>
         </w:tc>
@@ -10607,7 +10163,7 @@
                 <w:sz w:val="18"/>
                 <w:szCs w:val="18"/>
               </w:rPr>
-              <w:t xml:space="preserve">8.4 ★   SPEAKER 1 — Juan Carlo</w:t>
+              <w:t xml:space="preserve">8.3   SPEAKER 1 — Juan Carlo</w:t>
             </w:r>
           </w:p>
         </w:tc>
@@ -10681,7 +10237,7 @@
                 <w:sz w:val="19"/>
                 <w:szCs w:val="19"/>
               </w:rPr>
-              <w:t xml:space="preserve">Click Cash in / out, choose Taken out, enter a small amount and the reason "Demo", click Record cash taken out, then Record it.</w:t>
+              <w:t xml:space="preserve">Enter enough cash, click Charge, then Complete sale.</w:t>
             </w:r>
           </w:p>
         </w:tc>
@@ -10754,7 +10310,7 @@
                 <w:sz w:val="20"/>
                 <w:szCs w:val="20"/>
               </w:rPr>
-              <w:t xml:space="preserve">"Any cash that leaves the drawer for a reason other than a sale is recorded with who took it and why, so the count at the end of the day still adds up. This is BR-09."</w:t>
+              <w:t xml:space="preserve">"With enough cash, the sale is completed: the change is shown, the receipt prints on the thermal printer, and the stock goes down at once. This is BR 2.3, 2.4 and 7.2."</w:t>
             </w:r>
           </w:p>
         </w:tc>
@@ -10830,7 +10386,7 @@
                 <w:sz w:val="18"/>
                 <w:szCs w:val="18"/>
               </w:rPr>
-              <w:t xml:space="preserve">"Recorded"</w:t>
+              <w:t xml:space="preserve">"Sale completed! Change: ₱…"</w:t>
             </w:r>
           </w:p>
         </w:tc>
@@ -10895,7 +10451,7 @@
                 <w:sz w:val="18"/>
                 <w:szCs w:val="18"/>
               </w:rPr>
-              <w:t xml:space="preserve">8.5   SPEAKER 1 — Juan Carlo</w:t>
+              <w:t xml:space="preserve">8.4 ★   SPEAKER 1 — Juan Carlo</w:t>
             </w:r>
           </w:p>
         </w:tc>
@@ -10969,7 +10525,7 @@
                 <w:sz w:val="19"/>
                 <w:szCs w:val="19"/>
               </w:rPr>
-              <w:t xml:space="preserve">Click My sales today, click Ask for void on the demo sale, enter a reason such as "Wrong item rung up", then click Send request.</w:t>
+              <w:t xml:space="preserve">Click Cash in / out, choose Taken out, enter a small amount and the reason "Demo", click Record cash taken out, then Record it.</w:t>
             </w:r>
           </w:p>
         </w:tc>
@@ -11042,7 +10598,295 @@
                 <w:sz w:val="20"/>
                 <w:szCs w:val="20"/>
               </w:rPr>
-              <w:t xml:space="preserve">"If the cashier makes a mistake, they cannot delete or void a sale themselves. They ask, with a reason, and the administrator decides. This is BR-10."</w:t>
+              <w:t xml:space="preserve">"Any cash that leaves the drawer for a reason other than a sale is recorded with who took it and why, so the count at the end of the day still adds up."</w:t>
+            </w:r>
+          </w:p>
+        </w:tc>
+      </w:tr>
+      <w:tr>
+        <w:trPr>
+          <w:cantSplit/>
+        </w:trPr>
+        <w:tc>
+          <w:tcPr>
+            <w:tcW w:type="dxa" w:w="1300"/>
+            <w:tcBorders>
+              <w:top w:val="single" w:color="A6A6A6" w:sz="4"/>
+              <w:left w:val="single" w:color="A6A6A6" w:sz="4"/>
+              <w:bottom w:val="single" w:color="A6A6A6" w:sz="4"/>
+              <w:right w:val="single" w:color="A6A6A6" w:sz="4"/>
+            </w:tcBorders>
+            <w:shd w:fill="EEEEEE" w:val="clear"/>
+            <w:tcMar>
+              <w:top w:type="dxa" w:w="70"/>
+              <w:left w:type="dxa" w:w="120"/>
+              <w:bottom w:type="dxa" w:w="70"/>
+              <w:right w:type="dxa" w:w="120"/>
+            </w:tcMar>
+            <w:vAlign w:val="top"/>
+          </w:tcPr>
+          <w:p>
+            <w:pPr>
+              <w:spacing w:after="0" w:line="264"/>
+              <w:jc w:val="left"/>
+            </w:pPr>
+            <w:r>
+              <w:rPr>
+                <w:rFonts w:ascii="Arial" w:cs="Arial" w:eastAsia="Arial" w:hAnsi="Arial"/>
+                <w:b/>
+                <w:bCs/>
+                <w:color w:val="444444"/>
+                <w:sz w:val="17"/>
+                <w:szCs w:val="17"/>
+              </w:rPr>
+              <w:t xml:space="preserve">POINT AT</w:t>
+            </w:r>
+          </w:p>
+        </w:tc>
+        <w:tc>
+          <w:tcPr>
+            <w:tcW w:type="dxa" w:w="8060"/>
+            <w:tcBorders>
+              <w:top w:val="single" w:color="A6A6A6" w:sz="4"/>
+              <w:left w:val="single" w:color="A6A6A6" w:sz="4"/>
+              <w:bottom w:val="single" w:color="A6A6A6" w:sz="4"/>
+              <w:right w:val="single" w:color="A6A6A6" w:sz="4"/>
+            </w:tcBorders>
+            <w:shd w:fill="F7F7F7" w:val="clear"/>
+            <w:tcMar>
+              <w:top w:type="dxa" w:w="70"/>
+              <w:left w:type="dxa" w:w="120"/>
+              <w:bottom w:type="dxa" w:w="70"/>
+              <w:right w:type="dxa" w:w="120"/>
+            </w:tcMar>
+            <w:vAlign w:val="top"/>
+          </w:tcPr>
+          <w:p>
+            <w:pPr>
+              <w:spacing w:after="0" w:line="264"/>
+              <w:jc w:val="left"/>
+            </w:pPr>
+            <w:r>
+              <w:rPr>
+                <w:rFonts w:ascii="Arial" w:cs="Arial" w:eastAsia="Arial" w:hAnsi="Arial"/>
+                <w:i/>
+                <w:iCs/>
+                <w:sz w:val="18"/>
+                <w:szCs w:val="18"/>
+              </w:rPr>
+              <w:t xml:space="preserve">"Recorded"</w:t>
+            </w:r>
+          </w:p>
+        </w:tc>
+      </w:tr>
+    </w:tbl>
+    <w:p>
+      <w:pPr>
+        <w:spacing w:after="160"/>
+      </w:pPr>
+    </w:p>
+    <w:tbl>
+      <w:tblPr>
+        <w:tblW w:type="dxa" w:w="9360"/>
+        <w:tblBorders>
+          <w:top w:val="single" w:color="auto" w:sz="4"/>
+          <w:left w:val="single" w:color="auto" w:sz="4"/>
+          <w:bottom w:val="single" w:color="auto" w:sz="4"/>
+          <w:right w:val="single" w:color="auto" w:sz="4"/>
+          <w:insideH w:val="single" w:color="auto" w:sz="4"/>
+          <w:insideV w:val="single" w:color="auto" w:sz="4"/>
+        </w:tblBorders>
+        <w:tblLayout w:type="fixed"/>
+      </w:tblPr>
+      <w:tblGrid>
+        <w:gridCol w:w="1300"/>
+        <w:gridCol w:w="8060"/>
+      </w:tblGrid>
+      <w:tr>
+        <w:trPr>
+          <w:cantSplit/>
+        </w:trPr>
+        <w:tc>
+          <w:tcPr>
+            <w:tcW w:type="dxa" w:w="9360"/>
+            <w:gridSpan w:val="2"/>
+            <w:tcBorders>
+              <w:top w:val="single" w:color="A6A6A6" w:sz="4"/>
+              <w:left w:val="single" w:color="A6A6A6" w:sz="4"/>
+              <w:bottom w:val="single" w:color="A6A6A6" w:sz="4"/>
+              <w:right w:val="single" w:color="A6A6A6" w:sz="4"/>
+            </w:tcBorders>
+            <w:shd w:fill="3E8E41" w:val="clear"/>
+            <w:tcMar>
+              <w:top w:type="dxa" w:w="70"/>
+              <w:left w:type="dxa" w:w="120"/>
+              <w:bottom w:type="dxa" w:w="70"/>
+              <w:right w:type="dxa" w:w="120"/>
+            </w:tcMar>
+            <w:vAlign w:val="center"/>
+          </w:tcPr>
+          <w:p>
+            <w:pPr>
+              <w:spacing w:after="0" w:line="264"/>
+              <w:jc w:val="left"/>
+            </w:pPr>
+            <w:r>
+              <w:rPr>
+                <w:rFonts w:ascii="Arial" w:cs="Arial" w:eastAsia="Arial" w:hAnsi="Arial"/>
+                <w:b/>
+                <w:bCs/>
+                <w:color w:val="FFFFFF"/>
+                <w:sz w:val="18"/>
+                <w:szCs w:val="18"/>
+              </w:rPr>
+              <w:t xml:space="preserve">8.5   SPEAKER 1 — Juan Carlo</w:t>
+            </w:r>
+          </w:p>
+        </w:tc>
+      </w:tr>
+      <w:tr>
+        <w:trPr>
+          <w:cantSplit/>
+        </w:trPr>
+        <w:tc>
+          <w:tcPr>
+            <w:tcW w:type="dxa" w:w="1300"/>
+            <w:tcBorders>
+              <w:top w:val="single" w:color="A6A6A6" w:sz="4"/>
+              <w:left w:val="single" w:color="A6A6A6" w:sz="4"/>
+              <w:bottom w:val="single" w:color="A6A6A6" w:sz="4"/>
+              <w:right w:val="single" w:color="A6A6A6" w:sz="4"/>
+            </w:tcBorders>
+            <w:shd w:fill="FFF4D6" w:val="clear"/>
+            <w:tcMar>
+              <w:top w:type="dxa" w:w="70"/>
+              <w:left w:type="dxa" w:w="120"/>
+              <w:bottom w:type="dxa" w:w="70"/>
+              <w:right w:type="dxa" w:w="120"/>
+            </w:tcMar>
+            <w:vAlign w:val="top"/>
+          </w:tcPr>
+          <w:p>
+            <w:pPr>
+              <w:spacing w:after="0" w:line="264"/>
+              <w:jc w:val="left"/>
+            </w:pPr>
+            <w:r>
+              <w:rPr>
+                <w:rFonts w:ascii="Arial" w:cs="Arial" w:eastAsia="Arial" w:hAnsi="Arial"/>
+                <w:b/>
+                <w:bCs/>
+                <w:color w:val="7A4B00"/>
+                <w:sz w:val="17"/>
+                <w:szCs w:val="17"/>
+              </w:rPr>
+              <w:t xml:space="preserve">DO</w:t>
+            </w:r>
+          </w:p>
+        </w:tc>
+        <w:tc>
+          <w:tcPr>
+            <w:tcW w:type="dxa" w:w="8060"/>
+            <w:tcBorders>
+              <w:top w:val="single" w:color="A6A6A6" w:sz="4"/>
+              <w:left w:val="single" w:color="A6A6A6" w:sz="4"/>
+              <w:bottom w:val="single" w:color="A6A6A6" w:sz="4"/>
+              <w:right w:val="single" w:color="A6A6A6" w:sz="4"/>
+            </w:tcBorders>
+            <w:shd w:fill="FFF4D6" w:val="clear"/>
+            <w:tcMar>
+              <w:top w:type="dxa" w:w="70"/>
+              <w:left w:type="dxa" w:w="120"/>
+              <w:bottom w:type="dxa" w:w="70"/>
+              <w:right w:type="dxa" w:w="120"/>
+            </w:tcMar>
+            <w:vAlign w:val="top"/>
+          </w:tcPr>
+          <w:p>
+            <w:pPr>
+              <w:spacing w:after="0" w:line="264"/>
+              <w:jc w:val="left"/>
+            </w:pPr>
+            <w:r>
+              <w:rPr>
+                <w:rFonts w:ascii="Arial" w:cs="Arial" w:eastAsia="Arial" w:hAnsi="Arial"/>
+                <w:sz w:val="19"/>
+                <w:szCs w:val="19"/>
+              </w:rPr>
+              <w:t xml:space="preserve">Click My sales today, click Ask for void on the demo sale, enter a reason such as "Wrong item rung up", then click Send request.</w:t>
+            </w:r>
+          </w:p>
+        </w:tc>
+      </w:tr>
+      <w:tr>
+        <w:trPr>
+          <w:cantSplit/>
+        </w:trPr>
+        <w:tc>
+          <w:tcPr>
+            <w:tcW w:type="dxa" w:w="1300"/>
+            <w:tcBorders>
+              <w:top w:val="single" w:color="A6A6A6" w:sz="4"/>
+              <w:left w:val="single" w:color="A6A6A6" w:sz="4"/>
+              <w:bottom w:val="single" w:color="A6A6A6" w:sz="4"/>
+              <w:right w:val="single" w:color="A6A6A6" w:sz="4"/>
+            </w:tcBorders>
+            <w:shd w:fill="E8F3E5" w:val="clear"/>
+            <w:tcMar>
+              <w:top w:type="dxa" w:w="70"/>
+              <w:left w:type="dxa" w:w="120"/>
+              <w:bottom w:type="dxa" w:w="70"/>
+              <w:right w:type="dxa" w:w="120"/>
+            </w:tcMar>
+            <w:vAlign w:val="top"/>
+          </w:tcPr>
+          <w:p>
+            <w:pPr>
+              <w:spacing w:after="0" w:line="264"/>
+              <w:jc w:val="left"/>
+            </w:pPr>
+            <w:r>
+              <w:rPr>
+                <w:rFonts w:ascii="Arial" w:cs="Arial" w:eastAsia="Arial" w:hAnsi="Arial"/>
+                <w:b/>
+                <w:bCs/>
+                <w:color w:val="1E4D2B"/>
+                <w:sz w:val="17"/>
+                <w:szCs w:val="17"/>
+              </w:rPr>
+              <w:t xml:space="preserve">SAY</w:t>
+            </w:r>
+          </w:p>
+        </w:tc>
+        <w:tc>
+          <w:tcPr>
+            <w:tcW w:type="dxa" w:w="8060"/>
+            <w:tcBorders>
+              <w:top w:val="single" w:color="A6A6A6" w:sz="4"/>
+              <w:left w:val="single" w:color="A6A6A6" w:sz="4"/>
+              <w:bottom w:val="single" w:color="A6A6A6" w:sz="4"/>
+              <w:right w:val="single" w:color="A6A6A6" w:sz="4"/>
+            </w:tcBorders>
+            <w:tcMar>
+              <w:top w:type="dxa" w:w="70"/>
+              <w:left w:type="dxa" w:w="120"/>
+              <w:bottom w:type="dxa" w:w="70"/>
+              <w:right w:type="dxa" w:w="120"/>
+            </w:tcMar>
+            <w:vAlign w:val="top"/>
+          </w:tcPr>
+          <w:p>
+            <w:pPr>
+              <w:spacing w:after="0" w:line="264"/>
+              <w:jc w:val="left"/>
+            </w:pPr>
+            <w:r>
+              <w:rPr>
+                <w:rFonts w:ascii="Arial" w:cs="Arial" w:eastAsia="Arial" w:hAnsi="Arial"/>
+                <w:sz w:val="20"/>
+                <w:szCs w:val="20"/>
+              </w:rPr>
+              <w:t xml:space="preserve">"If the cashier makes a mistake, they cannot delete or void a sale themselves. They ask, with a reason, and the administrator decides."</w:t>
             </w:r>
           </w:p>
         </w:tc>
@@ -11575,7 +11419,7 @@
                 <w:sz w:val="20"/>
                 <w:szCs w:val="20"/>
               </w:rPr>
-              <w:t xml:space="preserve">"The cashier's request is here with the reason. The administrator voids the sale: its items return to stock and it is left out of every total, but it stays on record marked Voided, and the Activity log keeps who did it and when."</w:t>
+              <w:t xml:space="preserve">"The cashier's request is here with the reason. The administrator voids the sale: its items return to stock and it is left out of every total, but it stays on record marked Voided, and the Activity log keeps who did it and when. This is BR 6.4."</w:t>
             </w:r>
           </w:p>
         </w:tc>
@@ -12075,7 +11919,7 @@
                 <w:sz w:val="20"/>
                 <w:szCs w:val="20"/>
               </w:rPr>
-              <w:t xml:space="preserve">"Reports show revenue, sales, the average sale and items sold for any period, by day, week or month, with the best sellers and sales by category. Any report can be exported. This is BR-13."</w:t>
+              <w:t xml:space="preserve">"Reports show revenue, sales, the average sale and items sold for any period, by day, week or month, with the best sellers and sales by category. Any report can be exported. This is BR 5.1 and 5.5."</w:t>
             </w:r>
           </w:p>
         </w:tc>
@@ -12301,7 +12145,7 @@
                 <w:sz w:val="20"/>
                 <w:szCs w:val="20"/>
               </w:rPr>
-              <w:t xml:space="preserve">"A product that is too new for the models gets a simple trend, and a product with less than 14 days of sales gets a cautious first estimate, and the page says so."</w:t>
+              <w:t xml:space="preserve">"A product that is too new for the models gets a simple trend, and a product with less than 14 days of sales gets a cautious first estimate, and the page says so. This is BR 4.1 and 2.2."</w:t>
             </w:r>
           </w:p>
         </w:tc>
@@ -12527,7 +12371,219 @@
                 <w:sz w:val="20"/>
                 <w:szCs w:val="20"/>
               </w:rPr>
-              <w:t xml:space="preserve">"Too much stock shows where money is tied up, and Likely to expire before it sells warns before an expiry loss happens. This is BR-11."</w:t>
+              <w:t xml:space="preserve">"Too much stock shows where money is tied up, and Likely to expire before it sells warns before an expiry loss happens. This is BR 4.2."</w:t>
+            </w:r>
+          </w:p>
+        </w:tc>
+      </w:tr>
+    </w:tbl>
+    <w:p>
+      <w:pPr>
+        <w:spacing w:after="160"/>
+      </w:pPr>
+    </w:p>
+    <w:tbl>
+      <w:tblPr>
+        <w:tblW w:type="dxa" w:w="9360"/>
+        <w:tblBorders>
+          <w:top w:val="single" w:color="auto" w:sz="4"/>
+          <w:left w:val="single" w:color="auto" w:sz="4"/>
+          <w:bottom w:val="single" w:color="auto" w:sz="4"/>
+          <w:right w:val="single" w:color="auto" w:sz="4"/>
+          <w:insideH w:val="single" w:color="auto" w:sz="4"/>
+          <w:insideV w:val="single" w:color="auto" w:sz="4"/>
+        </w:tblBorders>
+        <w:tblLayout w:type="fixed"/>
+      </w:tblPr>
+      <w:tblGrid>
+        <w:gridCol w:w="1300"/>
+        <w:gridCol w:w="8060"/>
+      </w:tblGrid>
+      <w:tr>
+        <w:trPr>
+          <w:cantSplit/>
+        </w:trPr>
+        <w:tc>
+          <w:tcPr>
+            <w:tcW w:type="dxa" w:w="9360"/>
+            <w:gridSpan w:val="2"/>
+            <w:tcBorders>
+              <w:top w:val="single" w:color="A6A6A6" w:sz="4"/>
+              <w:left w:val="single" w:color="A6A6A6" w:sz="4"/>
+              <w:bottom w:val="single" w:color="A6A6A6" w:sz="4"/>
+              <w:right w:val="single" w:color="A6A6A6" w:sz="4"/>
+            </w:tcBorders>
+            <w:shd w:fill="3E8E41" w:val="clear"/>
+            <w:tcMar>
+              <w:top w:type="dxa" w:w="70"/>
+              <w:left w:type="dxa" w:w="120"/>
+              <w:bottom w:type="dxa" w:w="70"/>
+              <w:right w:type="dxa" w:w="120"/>
+            </w:tcMar>
+            <w:vAlign w:val="center"/>
+          </w:tcPr>
+          <w:p>
+            <w:pPr>
+              <w:spacing w:after="0" w:line="264"/>
+              <w:jc w:val="left"/>
+            </w:pPr>
+            <w:r>
+              <w:rPr>
+                <w:rFonts w:ascii="Arial" w:cs="Arial" w:eastAsia="Arial" w:hAnsi="Arial"/>
+                <w:b/>
+                <w:bCs/>
+                <w:color w:val="FFFFFF"/>
+                <w:sz w:val="18"/>
+                <w:szCs w:val="18"/>
+              </w:rPr>
+              <w:t xml:space="preserve">9.5b   SPEAKER 2 — Joylinda</w:t>
+            </w:r>
+          </w:p>
+        </w:tc>
+      </w:tr>
+      <w:tr>
+        <w:trPr>
+          <w:cantSplit/>
+        </w:trPr>
+        <w:tc>
+          <w:tcPr>
+            <w:tcW w:type="dxa" w:w="1300"/>
+            <w:tcBorders>
+              <w:top w:val="single" w:color="A6A6A6" w:sz="4"/>
+              <w:left w:val="single" w:color="A6A6A6" w:sz="4"/>
+              <w:bottom w:val="single" w:color="A6A6A6" w:sz="4"/>
+              <w:right w:val="single" w:color="A6A6A6" w:sz="4"/>
+            </w:tcBorders>
+            <w:shd w:fill="FFF4D6" w:val="clear"/>
+            <w:tcMar>
+              <w:top w:type="dxa" w:w="70"/>
+              <w:left w:type="dxa" w:w="120"/>
+              <w:bottom w:type="dxa" w:w="70"/>
+              <w:right w:type="dxa" w:w="120"/>
+            </w:tcMar>
+            <w:vAlign w:val="top"/>
+          </w:tcPr>
+          <w:p>
+            <w:pPr>
+              <w:spacing w:after="0" w:line="264"/>
+              <w:jc w:val="left"/>
+            </w:pPr>
+            <w:r>
+              <w:rPr>
+                <w:rFonts w:ascii="Arial" w:cs="Arial" w:eastAsia="Arial" w:hAnsi="Arial"/>
+                <w:b/>
+                <w:bCs/>
+                <w:color w:val="7A4B00"/>
+                <w:sz w:val="17"/>
+                <w:szCs w:val="17"/>
+              </w:rPr>
+              <w:t xml:space="preserve">DO</w:t>
+            </w:r>
+          </w:p>
+        </w:tc>
+        <w:tc>
+          <w:tcPr>
+            <w:tcW w:type="dxa" w:w="8060"/>
+            <w:tcBorders>
+              <w:top w:val="single" w:color="A6A6A6" w:sz="4"/>
+              <w:left w:val="single" w:color="A6A6A6" w:sz="4"/>
+              <w:bottom w:val="single" w:color="A6A6A6" w:sz="4"/>
+              <w:right w:val="single" w:color="A6A6A6" w:sz="4"/>
+            </w:tcBorders>
+            <w:shd w:fill="FFF4D6" w:val="clear"/>
+            <w:tcMar>
+              <w:top w:type="dxa" w:w="70"/>
+              <w:left w:type="dxa" w:w="120"/>
+              <w:bottom w:type="dxa" w:w="70"/>
+              <w:right w:type="dxa" w:w="120"/>
+            </w:tcMar>
+            <w:vAlign w:val="top"/>
+          </w:tcPr>
+          <w:p>
+            <w:pPr>
+              <w:spacing w:after="0" w:line="264"/>
+              <w:jc w:val="left"/>
+            </w:pPr>
+            <w:r>
+              <w:rPr>
+                <w:rFonts w:ascii="Arial" w:cs="Arial" w:eastAsia="Arial" w:hAnsi="Arial"/>
+                <w:sz w:val="19"/>
+                <w:szCs w:val="19"/>
+              </w:rPr>
+              <w:t xml:space="preserve">Scroll to Busiest days of the week and Sales by month.</w:t>
+            </w:r>
+          </w:p>
+        </w:tc>
+      </w:tr>
+      <w:tr>
+        <w:trPr>
+          <w:cantSplit/>
+        </w:trPr>
+        <w:tc>
+          <w:tcPr>
+            <w:tcW w:type="dxa" w:w="1300"/>
+            <w:tcBorders>
+              <w:top w:val="single" w:color="A6A6A6" w:sz="4"/>
+              <w:left w:val="single" w:color="A6A6A6" w:sz="4"/>
+              <w:bottom w:val="single" w:color="A6A6A6" w:sz="4"/>
+              <w:right w:val="single" w:color="A6A6A6" w:sz="4"/>
+            </w:tcBorders>
+            <w:shd w:fill="E8F3E5" w:val="clear"/>
+            <w:tcMar>
+              <w:top w:type="dxa" w:w="70"/>
+              <w:left w:type="dxa" w:w="120"/>
+              <w:bottom w:type="dxa" w:w="70"/>
+              <w:right w:type="dxa" w:w="120"/>
+            </w:tcMar>
+            <w:vAlign w:val="top"/>
+          </w:tcPr>
+          <w:p>
+            <w:pPr>
+              <w:spacing w:after="0" w:line="264"/>
+              <w:jc w:val="left"/>
+            </w:pPr>
+            <w:r>
+              <w:rPr>
+                <w:rFonts w:ascii="Arial" w:cs="Arial" w:eastAsia="Arial" w:hAnsi="Arial"/>
+                <w:b/>
+                <w:bCs/>
+                <w:color w:val="1E4D2B"/>
+                <w:sz w:val="17"/>
+                <w:szCs w:val="17"/>
+              </w:rPr>
+              <w:t xml:space="preserve">SAY</w:t>
+            </w:r>
+          </w:p>
+        </w:tc>
+        <w:tc>
+          <w:tcPr>
+            <w:tcW w:type="dxa" w:w="8060"/>
+            <w:tcBorders>
+              <w:top w:val="single" w:color="A6A6A6" w:sz="4"/>
+              <w:left w:val="single" w:color="A6A6A6" w:sz="4"/>
+              <w:bottom w:val="single" w:color="A6A6A6" w:sz="4"/>
+              <w:right w:val="single" w:color="A6A6A6" w:sz="4"/>
+            </w:tcBorders>
+            <w:tcMar>
+              <w:top w:type="dxa" w:w="70"/>
+              <w:left w:type="dxa" w:w="120"/>
+              <w:bottom w:type="dxa" w:w="70"/>
+              <w:right w:type="dxa" w:w="120"/>
+            </w:tcMar>
+            <w:vAlign w:val="top"/>
+          </w:tcPr>
+          <w:p>
+            <w:pPr>
+              <w:spacing w:after="0" w:line="264"/>
+              <w:jc w:val="left"/>
+            </w:pPr>
+            <w:r>
+              <w:rPr>
+                <w:rFonts w:ascii="Arial" w:cs="Arial" w:eastAsia="Arial" w:hAnsi="Arial"/>
+                <w:sz w:val="20"/>
+                <w:szCs w:val="20"/>
+              </w:rPr>
+              <w:t xml:space="preserve">"These charts show the shop's patterns over the week and over the year, the seasonal trends the forecast learns from. This is BR 4.3."</w:t>
             </w:r>
           </w:p>
         </w:tc>
@@ -12984,7 +13040,7 @@
                 <w:sz w:val="20"/>
                 <w:szCs w:val="20"/>
               </w:rPr>
-              <w:t xml:space="preserve">"It meets the business requirements we set, for the three roles that run the shop: the administrator, the cashier and the supplier."</w:t>
+              <w:t xml:space="preserve">"It meets the seven groups of business requirements we signed with the owner, for the three roles that run the shop: the administrator, the cashier and the supplier."</w:t>
             </w:r>
           </w:p>
           <w:p>
@@ -13043,7 +13099,7 @@
           <w:sz w:val="21"/>
           <w:szCs w:val="21"/>
         </w:rPr>
-        <w:t xml:space="preserve">FETCH is built for one shop with one till, and the counter takes cash only.</w:t>
+        <w:t xml:space="preserve">From the signed form: one location only; no e-commerce, online payment, accounting or payroll, CRM or loyalty program.</w:t>
       </w:r>
     </w:p>
     <w:p>
@@ -13061,7 +13117,25 @@
           <w:sz w:val="21"/>
           <w:szCs w:val="21"/>
         </w:rPr>
-        <w:t xml:space="preserve">The forecast is only as good as the sales history: products with little history get a cautious estimate, and the page says so.</w:t>
+        <w:t xml:space="preserve">The forecast needs 3 to 12 months of sales history, learns only from Risha Pet Supplies' own past sales, and cannot predict events that never happened before. Products with little history get a cautious estimate, and the page says so.</w:t>
+      </w:r>
+    </w:p>
+    <w:p>
+      <w:pPr>
+        <w:pStyle w:val="ListParagraph"/>
+        <w:numPr>
+          <w:ilvl w:val="0"/>
+          <w:numId w:val="2"/>
+        </w:numPr>
+        <w:spacing w:after="60" w:line="276"/>
+      </w:pPr>
+      <w:r>
+        <w:rPr>
+          <w:rFonts w:ascii="Arial" w:cs="Arial" w:eastAsia="Arial" w:hAnsi="Arial"/>
+          <w:sz w:val="21"/>
+          <w:szCs w:val="21"/>
+        </w:rPr>
+        <w:t xml:space="preserve">The counter takes cash only.</w:t>
       </w:r>
     </w:p>
     <w:p>
@@ -13914,6 +13988,228 @@
                 <w:szCs w:val="19"/>
               </w:rPr>
               <w:t xml:space="preserve">It is counted at the selling price, so it shows what the stock would bring in if it all sold. Stock planning shows money tied up at cost.</w:t>
+            </w:r>
+          </w:p>
+        </w:tc>
+      </w:tr>
+      <w:tr>
+        <w:trPr>
+          <w:cantSplit/>
+        </w:trPr>
+        <w:tc>
+          <w:tcPr>
+            <w:tcW w:type="dxa" w:w="3000"/>
+            <w:tcBorders>
+              <w:top w:val="single" w:color="A6A6A6" w:sz="4"/>
+              <w:left w:val="single" w:color="A6A6A6" w:sz="4"/>
+              <w:bottom w:val="single" w:color="A6A6A6" w:sz="4"/>
+              <w:right w:val="single" w:color="A6A6A6" w:sz="4"/>
+            </w:tcBorders>
+            <w:shd w:fill="E8F3E5" w:val="clear"/>
+            <w:tcMar>
+              <w:top w:type="dxa" w:w="70"/>
+              <w:left w:type="dxa" w:w="120"/>
+              <w:bottom w:type="dxa" w:w="70"/>
+              <w:right w:type="dxa" w:w="120"/>
+            </w:tcMar>
+            <w:vAlign w:val="top"/>
+          </w:tcPr>
+          <w:p>
+            <w:pPr>
+              <w:spacing w:after="0" w:line="264"/>
+              <w:jc w:val="left"/>
+            </w:pPr>
+            <w:r>
+              <w:rPr>
+                <w:rFonts w:ascii="Arial" w:cs="Arial" w:eastAsia="Arial" w:hAnsi="Arial"/>
+                <w:b/>
+                <w:bCs/>
+                <w:sz w:val="19"/>
+                <w:szCs w:val="19"/>
+              </w:rPr>
+              <w:t xml:space="preserve">How did you evaluate usability?</w:t>
+            </w:r>
+          </w:p>
+        </w:tc>
+        <w:tc>
+          <w:tcPr>
+            <w:tcW w:type="dxa" w:w="6360"/>
+            <w:tcBorders>
+              <w:top w:val="single" w:color="A6A6A6" w:sz="4"/>
+              <w:left w:val="single" w:color="A6A6A6" w:sz="4"/>
+              <w:bottom w:val="single" w:color="A6A6A6" w:sz="4"/>
+              <w:right w:val="single" w:color="A6A6A6" w:sz="4"/>
+            </w:tcBorders>
+            <w:tcMar>
+              <w:top w:type="dxa" w:w="70"/>
+              <w:left w:type="dxa" w:w="120"/>
+              <w:bottom w:type="dxa" w:w="70"/>
+              <w:right w:type="dxa" w:w="120"/>
+            </w:tcMar>
+            <w:vAlign w:val="top"/>
+          </w:tcPr>
+          <w:p>
+            <w:pPr>
+              <w:spacing w:after="0" w:line="264"/>
+              <w:jc w:val="left"/>
+            </w:pPr>
+            <w:r>
+              <w:rPr>
+                <w:rFonts w:ascii="Arial" w:cs="Arial" w:eastAsia="Arial" w:hAnsi="Arial"/>
+                <w:b w:val="false"/>
+                <w:bCs w:val="false"/>
+                <w:sz w:val="19"/>
+                <w:szCs w:val="19"/>
+              </w:rPr>
+              <w:t xml:space="preserve">With the CSUQ (Computer System Usability Questionnaire): system usefulness, information quality, interface quality and overall satisfaction. [Give your results here.]</w:t>
+            </w:r>
+          </w:p>
+        </w:tc>
+      </w:tr>
+      <w:tr>
+        <w:trPr>
+          <w:cantSplit/>
+        </w:trPr>
+        <w:tc>
+          <w:tcPr>
+            <w:tcW w:type="dxa" w:w="3000"/>
+            <w:tcBorders>
+              <w:top w:val="single" w:color="A6A6A6" w:sz="4"/>
+              <w:left w:val="single" w:color="A6A6A6" w:sz="4"/>
+              <w:bottom w:val="single" w:color="A6A6A6" w:sz="4"/>
+              <w:right w:val="single" w:color="A6A6A6" w:sz="4"/>
+            </w:tcBorders>
+            <w:shd w:fill="E8F3E5" w:val="clear"/>
+            <w:tcMar>
+              <w:top w:type="dxa" w:w="70"/>
+              <w:left w:type="dxa" w:w="120"/>
+              <w:bottom w:type="dxa" w:w="70"/>
+              <w:right w:type="dxa" w:w="120"/>
+            </w:tcMar>
+            <w:vAlign w:val="top"/>
+          </w:tcPr>
+          <w:p>
+            <w:pPr>
+              <w:spacing w:after="0" w:line="264"/>
+              <w:jc w:val="left"/>
+            </w:pPr>
+            <w:r>
+              <w:rPr>
+                <w:rFonts w:ascii="Arial" w:cs="Arial" w:eastAsia="Arial" w:hAnsi="Arial"/>
+                <w:b/>
+                <w:bCs/>
+                <w:sz w:val="19"/>
+                <w:szCs w:val="19"/>
+              </w:rPr>
+              <w:t xml:space="preserve">Chapter 1 names Java Spring Boot for the backend, but the system runs on Node.js. Why?</w:t>
+            </w:r>
+          </w:p>
+        </w:tc>
+        <w:tc>
+          <w:tcPr>
+            <w:tcW w:type="dxa" w:w="6360"/>
+            <w:tcBorders>
+              <w:top w:val="single" w:color="A6A6A6" w:sz="4"/>
+              <w:left w:val="single" w:color="A6A6A6" w:sz="4"/>
+              <w:bottom w:val="single" w:color="A6A6A6" w:sz="4"/>
+              <w:right w:val="single" w:color="A6A6A6" w:sz="4"/>
+            </w:tcBorders>
+            <w:tcMar>
+              <w:top w:type="dxa" w:w="70"/>
+              <w:left w:type="dxa" w:w="120"/>
+              <w:bottom w:type="dxa" w:w="70"/>
+              <w:right w:type="dxa" w:w="120"/>
+            </w:tcMar>
+            <w:vAlign w:val="top"/>
+          </w:tcPr>
+          <w:p>
+            <w:pPr>
+              <w:spacing w:after="0" w:line="264"/>
+              <w:jc w:val="left"/>
+            </w:pPr>
+            <w:r>
+              <w:rPr>
+                <w:rFonts w:ascii="Arial" w:cs="Arial" w:eastAsia="Arial" w:hAnsi="Arial"/>
+                <w:b w:val="false"/>
+                <w:bCs w:val="false"/>
+                <w:sz w:val="19"/>
+                <w:szCs w:val="19"/>
+              </w:rPr>
+              <w:t xml:space="preserve">[Agree on your answer before the defense.]</w:t>
+            </w:r>
+          </w:p>
+        </w:tc>
+      </w:tr>
+      <w:tr>
+        <w:trPr>
+          <w:cantSplit/>
+        </w:trPr>
+        <w:tc>
+          <w:tcPr>
+            <w:tcW w:type="dxa" w:w="3000"/>
+            <w:tcBorders>
+              <w:top w:val="single" w:color="A6A6A6" w:sz="4"/>
+              <w:left w:val="single" w:color="A6A6A6" w:sz="4"/>
+              <w:bottom w:val="single" w:color="A6A6A6" w:sz="4"/>
+              <w:right w:val="single" w:color="A6A6A6" w:sz="4"/>
+            </w:tcBorders>
+            <w:shd w:fill="E8F3E5" w:val="clear"/>
+            <w:tcMar>
+              <w:top w:type="dxa" w:w="70"/>
+              <w:left w:type="dxa" w:w="120"/>
+              <w:bottom w:type="dxa" w:w="70"/>
+              <w:right w:type="dxa" w:w="120"/>
+            </w:tcMar>
+            <w:vAlign w:val="top"/>
+          </w:tcPr>
+          <w:p>
+            <w:pPr>
+              <w:spacing w:after="0" w:line="264"/>
+              <w:jc w:val="left"/>
+            </w:pPr>
+            <w:r>
+              <w:rPr>
+                <w:rFonts w:ascii="Arial" w:cs="Arial" w:eastAsia="Arial" w:hAnsi="Arial"/>
+                <w:b/>
+                <w:bCs/>
+                <w:sz w:val="19"/>
+                <w:szCs w:val="19"/>
+              </w:rPr>
+              <w:t xml:space="preserve">The signed limitations say local operation and Windows only, but FETCH is online and runs on a Mac. Why?</w:t>
+            </w:r>
+          </w:p>
+        </w:tc>
+        <w:tc>
+          <w:tcPr>
+            <w:tcW w:type="dxa" w:w="6360"/>
+            <w:tcBorders>
+              <w:top w:val="single" w:color="A6A6A6" w:sz="4"/>
+              <w:left w:val="single" w:color="A6A6A6" w:sz="4"/>
+              <w:bottom w:val="single" w:color="A6A6A6" w:sz="4"/>
+              <w:right w:val="single" w:color="A6A6A6" w:sz="4"/>
+            </w:tcBorders>
+            <w:tcMar>
+              <w:top w:type="dxa" w:w="70"/>
+              <w:left w:type="dxa" w:w="120"/>
+              <w:bottom w:type="dxa" w:w="70"/>
+              <w:right w:type="dxa" w:w="120"/>
+            </w:tcMar>
+            <w:vAlign w:val="top"/>
+          </w:tcPr>
+          <w:p>
+            <w:pPr>
+              <w:spacing w:after="0" w:line="264"/>
+              <w:jc w:val="left"/>
+            </w:pPr>
+            <w:r>
+              <w:rPr>
+                <w:rFonts w:ascii="Arial" w:cs="Arial" w:eastAsia="Arial" w:hAnsi="Arial"/>
+                <w:b w:val="false"/>
+                <w:bCs w:val="false"/>
+                <w:sz w:val="19"/>
+                <w:szCs w:val="19"/>
+              </w:rPr>
+              <w:t xml:space="preserve">[Agree on your answer before the defense.]</w:t>
             </w:r>
           </w:p>
         </w:tc>

</xml_diff>

<commit_message>
Demo script: who evaluated the system (from the newer thesis version)
Co-Authored-By: Claude Opus 5.5 <noreply@anthropic.com>
</commit_message>
<xml_diff>
--- a/QA/FETCH-Demo-Script.docx
+++ b/QA/FETCH-Demo-Script.docx
@@ -14210,6 +14210,80 @@
                 <w:szCs w:val="19"/>
               </w:rPr>
               <w:t xml:space="preserve">[Agree on your answer before the defense.]</w:t>
+            </w:r>
+          </w:p>
+        </w:tc>
+      </w:tr>
+      <w:tr>
+        <w:trPr>
+          <w:cantSplit/>
+        </w:trPr>
+        <w:tc>
+          <w:tcPr>
+            <w:tcW w:type="dxa" w:w="3000"/>
+            <w:tcBorders>
+              <w:top w:val="single" w:color="A6A6A6" w:sz="4"/>
+              <w:left w:val="single" w:color="A6A6A6" w:sz="4"/>
+              <w:bottom w:val="single" w:color="A6A6A6" w:sz="4"/>
+              <w:right w:val="single" w:color="A6A6A6" w:sz="4"/>
+            </w:tcBorders>
+            <w:shd w:fill="E8F3E5" w:val="clear"/>
+            <w:tcMar>
+              <w:top w:type="dxa" w:w="70"/>
+              <w:left w:type="dxa" w:w="120"/>
+              <w:bottom w:type="dxa" w:w="70"/>
+              <w:right w:type="dxa" w:w="120"/>
+            </w:tcMar>
+            <w:vAlign w:val="top"/>
+          </w:tcPr>
+          <w:p>
+            <w:pPr>
+              <w:spacing w:after="0" w:line="264"/>
+              <w:jc w:val="left"/>
+            </w:pPr>
+            <w:r>
+              <w:rPr>
+                <w:rFonts w:ascii="Arial" w:cs="Arial" w:eastAsia="Arial" w:hAnsi="Arial"/>
+                <w:b/>
+                <w:bCs/>
+                <w:sz w:val="19"/>
+                <w:szCs w:val="19"/>
+              </w:rPr>
+              <w:t xml:space="preserve">Who evaluated the system?</w:t>
+            </w:r>
+          </w:p>
+        </w:tc>
+        <w:tc>
+          <w:tcPr>
+            <w:tcW w:type="dxa" w:w="6360"/>
+            <w:tcBorders>
+              <w:top w:val="single" w:color="A6A6A6" w:sz="4"/>
+              <w:left w:val="single" w:color="A6A6A6" w:sz="4"/>
+              <w:bottom w:val="single" w:color="A6A6A6" w:sz="4"/>
+              <w:right w:val="single" w:color="A6A6A6" w:sz="4"/>
+            </w:tcBorders>
+            <w:tcMar>
+              <w:top w:type="dxa" w:w="70"/>
+              <w:left w:type="dxa" w:w="120"/>
+              <w:bottom w:type="dxa" w:w="70"/>
+              <w:right w:type="dxa" w:w="120"/>
+            </w:tcMar>
+            <w:vAlign w:val="top"/>
+          </w:tcPr>
+          <w:p>
+            <w:pPr>
+              <w:spacing w:after="0" w:line="264"/>
+              <w:jc w:val="left"/>
+            </w:pPr>
+            <w:r>
+              <w:rPr>
+                <w:rFonts w:ascii="Arial" w:cs="Arial" w:eastAsia="Arial" w:hAnsi="Arial"/>
+                <w:b w:val="false"/>
+                <w:bCs w:val="false"/>
+                <w:sz w:val="19"/>
+                <w:szCs w:val="19"/>
+              </w:rPr>
+              <w:t xml:space="preserve">Chosen by purposive sampling: one owner and one staff member of Risha Pet Supplies as the main users, 5 to 10 suppliers for the reordering and notifications, 5 to 8 technical experts for the design, functions and forecast accuracy, and 5 to 10 owners or managers of other small pet shops for its relevance, through interviews, system testing, UAT and the CSUQ.</w:t>
             </w:r>
           </w:p>
         </w:tc>

</xml_diff>